<commit_message>
Add custom docx reference doc, abstract, and DiD interpretation helpers
Adds custom-reference-doc.docx (Times New Roman; bold black title/headings;
18/16/14/12/10pt sizing) wired into both the manuscript and supplemental docx
output. Adds abstract.md and references it from the README. Adds inline
helpers (pred_fit/gap_value/gap_formula/gap_change_label) to clarify that a
DiD coefficient's sign reflects shift direction, not gap widening/narrowing,
with a worked example in the manuscript text. Renames SESSION-LOG.md to
LOG.md and logs the session. Re-renders all manuscript/supplemental outputs.

Co-Authored-By: Claude Sonnet 5 <noreply@anthropic.com>
</commit_message>
<xml_diff>
--- a/_output/cue-energy.docx
+++ b/_output/cue-energy.docx
@@ -24,7 +24,7 @@
         <w:pStyle w:val="FirstParagraph"/>
       </w:pPr>
       <w:r>
-        <w:t xml:space="preserve">Mitigating climate change requires a significant shift away from fossil fuels toward alternative energy sources, such as renewable and nuclear energy. The energy transition requires action from all sectors of society, including governments. Public policy can guide the move away from fossil fuels; however, policy actions require sufficient public support. Public opinion can influence energy policy by incentivizing policymakers through support for clean energy, voting for candidates that advocate for clean energy, and supporting renewable energy projects in their community</w:t>
+        <w:t xml:space="preserve">Mitigating climate change requires a significant shift away from fossil fuels toward alternative energy sources such as renewables and nuclear energy. The energy transition requires action from all sectors of society, including governments. Public policy can guide the move away from fossil fuels; however, policy actions require sufficient public support. Public opinion can influence energy policy by incentivizing policymakers through support for clean energy, voting for candidates that advocate for clean energy, and supporting renewable energy projects in their community</w:t>
       </w:r>
       <w:r>
         <w:t xml:space="preserve"> </w:t>
@@ -33,7 +33,7 @@
         <w:t xml:space="preserve">(Gazmararian, Mildenberger, and Tingley 2026)</w:t>
       </w:r>
       <w:r>
-        <w:t xml:space="preserve">. Therefore, understanding the mechanisms that shape public opinion is important for the clean-energy transition.</w:t>
+        <w:t xml:space="preserve">. Therefore, understanding the mechanisms that shape public opinion is important for the clean energy transition.</w:t>
       </w:r>
     </w:p>
     <w:p>
@@ -50,7 +50,7 @@
         <w:t xml:space="preserve">(Dunlap, McCright, and Yarosh 2016; Egan and Mullin 2024; Hawes and Nowlin 2022)</w:t>
       </w:r>
       <w:r>
-        <w:t xml:space="preserve">. While views on climate change are extremely polarized among the US public, support for expanding renewable energy sources such as wind and solar has been generally strong in the last several years</w:t>
+        <w:t xml:space="preserve">. While views on climate change are extremely polarized among the US public, support for expanding renewable energy sources, such as wind and solar, has been generally strong in the last several years</w:t>
       </w:r>
       <w:r>
         <w:t xml:space="preserve"> </w:t>
@@ -67,7 +67,7 @@
         <w:pStyle w:val="BodyText"/>
       </w:pPr>
       <w:r>
-        <w:t xml:space="preserve">However, this may be changing, with views on fossil fuels and renewable energy sources becoming more polarized. Recent survey data from the Pew Research Center show that support for expanding renewable energy among Republicans has declined, from 65 percent in 2020 to 28 percent in 2026, while at the same time, support for expanding fossil fuels increased from 35 percent in 2020 to 71 percent in 2026 among Republicans</w:t>
+        <w:t xml:space="preserve">However, this may be changing, with views on fossil fuels and renewable energy sources becoming increasingly polarized. Recent survey data from the Pew Research Center show that support for expanding renewable energy among Republicans has declined, from 65 percent in 2020 to 28 percent in 2026, while at the same time, support for expanding fossil fuels increased from 35 percent in 2020 to 71 percent in 2026 among Republicans</w:t>
       </w:r>
       <w:r>
         <w:t xml:space="preserve"> </w:t>
@@ -84,7 +84,7 @@
         <w:pStyle w:val="BodyText"/>
       </w:pPr>
       <w:r>
-        <w:t xml:space="preserve">Using a survey experiment, I tested a set of pre-registered hypotheses to examine whether partisan or climate change cues could shift the general public’s preferred energy mix for electricity production. Respondents were given information about the current energy mix for electricity in the US. They were then either given a cue about Trump’s support/opposition to fossil fuels/renewables, a cue about the need to increase the use of renewables to address climate change, or placed in a control group with no cues. Overall, I find that conservative Republicans were responsive to the Trump cue, preferring more fossil fuels and fewer renewables than those who received the climate cue or no cue, but they were not responsive to the climate cue. Liberal Democrats were generally less responsive to either cue than were Republicans. Additionally, the Trump cue served to polarize views about fossil fuels, largely based on the shift among conservative Republicans. Finally, all respondents preferred an energy mix with fewer fossil fuels and more renewables for electricity production than the current US mix.</w:t>
+        <w:t xml:space="preserve">Using a survey experiment, I tested a set of preregistered hypotheses to examine whether partisan or climate change cues could shift the general public’s preferred energy mix for electricity production. Respondents were provided with information about the current energy mix for electricity in the US. They were then either given a cue about Trump’s support/opposition to fossil fuels/renewables, a cue about the need to increase the use of renewables to address climate change, or placed in a control group with no cues. Overall, I find that conservative Republicans were responsive to the Trump cue, preferring more fossil fuels and fewer renewables than those who received the climate cue or no cue, but they were not responsive to the climate cue. Liberal Democrats were generally less responsive to either cue than Republicans. Additionally, the Trump cue polarized views on fossil fuels, largely based on the shift among conservative Republicans. Finally, all respondents preferred an energy mix with fewer fossil fuels and more renewables for electricity production than the current US mix, regardless of the treatment condition.</w:t>
       </w:r>
     </w:p>
     <w:bookmarkEnd w:id="9"/>
@@ -137,7 +137,7 @@
         <w:pStyle w:val="BodyText"/>
       </w:pPr>
       <w:r>
-        <w:t xml:space="preserve">Public opinion regarding fossil fuels, such as coal, oil, and gas, is largely shaped by political beliefs. Compared to conservatives and Republicans, liberals and Democrats are less supportive of coal</w:t>
+        <w:t xml:space="preserve">Public opinion on fossil fuels, such as coal, oil, and gas, is largely shaped by political beliefs. Compared to conservatives and Republicans, liberals and Democrats are less supportive of coal</w:t>
       </w:r>
       <w:r>
         <w:t xml:space="preserve"> </w:t>
@@ -164,7 +164,7 @@
         <w:t xml:space="preserve">(Davis and Fisk 2014; Raimi, Krupnick, and Bazilian 2020)</w:t>
       </w:r>
       <w:r>
-        <w:t xml:space="preserve">. For liberals and Democrats, the risks of fossil fuels, including the health, environmental, and climate impacts, influence opposition to fossil fuels, whereas conservatives and Republicans tend to emphasize the economic and energy security benefits</w:t>
+        <w:t xml:space="preserve">. For liberals and Democrats, the risks of fossil fuels, including the health, environmental, and climate impacts, influence opposition to fossil fuels, whereas conservatives and Republicans tend to emphasize the economic and energy security benefits in their support</w:t>
       </w:r>
       <w:r>
         <w:t xml:space="preserve"> </w:t>
@@ -190,7 +190,7 @@
         <w:t xml:space="preserve">(Hawes and Nowlin 2022; Ter-Mkrtchyan et al. 2022)</w:t>
       </w:r>
       <w:r>
-        <w:t xml:space="preserve">. However, there are partisan differences, but they are differences in</w:t>
+        <w:t xml:space="preserve">. While there are some partisan differences, they are differences in</w:t>
       </w:r>
       <w:r>
         <w:t xml:space="preserve"> </w:t>
@@ -228,7 +228,7 @@
         <w:t xml:space="preserve">(Bergquist, Konisky, and Kotcher 2020; Hamilton et al. 2018)</w:t>
       </w:r>
       <w:r>
-        <w:t xml:space="preserve">. Additionally, the reasons for support vary by political beliefs. Conservatives/Republicans support renewable sources because of the economic benefits and costs, whereas liberals/Democrats support them because of climate concerns</w:t>
+        <w:t xml:space="preserve">. Additionally, the reasons for support vary by political beliefs. Conservatives/Republicans support renewable sources because of the economic benefits, whereas liberals/Democrats support them because of climate concerns</w:t>
       </w:r>
       <w:r>
         <w:t xml:space="preserve"> </w:t>
@@ -237,7 +237,7 @@
         <w:t xml:space="preserve">(Gustafson et al. 2020)</w:t>
       </w:r>
       <w:r>
-        <w:t xml:space="preserve">. In general, previous research suggests that the way that political beliefs shape the public’s views on fossil fuels and renewables is through the emphasis that conservatives/Republicans vs liberals/Democrats place on various aspect of energy. For conservatives/Republicans, the emphasis is on costs and benefits, but for liberals/Democrats, the emphasis is on health, environment, and climate change.</w:t>
+        <w:t xml:space="preserve">. In general, previous research suggests that political beliefs shape the public’s views on both fossil fuels and renewables because conservatives/Republicans vs liberals/Democrats emphasize different aspects of those energy sources. For conservatives/Republicans, the emphasis is on costs and benefits, whereas for liberals/Democrats, the emphasis is on health, the environment, and climate change.</w:t>
       </w:r>
     </w:p>
     <w:p>
@@ -245,7 +245,7 @@
         <w:pStyle w:val="BodyText"/>
       </w:pPr>
       <w:r>
-        <w:t xml:space="preserve">Views on nuclear energy are generally less polarized across political beliefs than those on fossil fuels or renewable sources. To the extent that nuclear energy is polarized, it tends to find more support among conservatives/Republicans than among liberals/Democrats</w:t>
+        <w:t xml:space="preserve">Views on nuclear energy are generally less polarized across political beliefs than those on fossil fuels and renewable sources. To the extent that nuclear energy is polarized, it tends to find more support among conservatives/Republicans than among liberals/Democrats</w:t>
       </w:r>
       <w:r>
         <w:t xml:space="preserve"> </w:t>
@@ -263,7 +263,7 @@
         <w:t xml:space="preserve">(Gupta et al. 2019)</w:t>
       </w:r>
       <w:r>
-        <w:t xml:space="preserve">. It is also noteworthy that even though nuclear energy does not emit greenhouse gases when generating electricity, those most concerned about climate change tend to be less supportive of nuclear energy</w:t>
+        <w:t xml:space="preserve">. It is also noteworthy that even though nuclear energy does not emit greenhouse gases when generating electricity, those most concerned about climate change tend to be less supportive of it as an energy source</w:t>
       </w:r>
       <w:r>
         <w:t xml:space="preserve"> </w:t>
@@ -280,7 +280,7 @@
         <w:pStyle w:val="BodyText"/>
       </w:pPr>
       <w:r>
-        <w:t xml:space="preserve">As noted, recent public surveys indicate that support among Republicans for renewables is falling, while support for fossil fuels is increasing. One reason for this trend may be that renewable energy has become entangled with climate change, leading to less Republican support. For example, support for renewable energy policy declined among conservatives when the policy was paired with a carbon capture and storage climate policy</w:t>
+        <w:t xml:space="preserve">As noted, recent public surveys indicate that support among Republicans for renewables is falling, while support for fossil fuels is increasing. One reason for this trend may be that renewable energy has become entangled with climate change, leading to less support among Republicans. For example, one study found that support for renewable energy policy declined among conservatives when the policy was paired with a carbon capture and storage climate policy</w:t>
       </w:r>
       <w:r>
         <w:t xml:space="preserve"> </w:t>
@@ -289,7 +289,7 @@
         <w:t xml:space="preserve">(Marlow and Makovi 2023)</w:t>
       </w:r>
       <w:r>
-        <w:t xml:space="preserve">. Therefore, if renewables are framed as an approach to address climate change, which causes a cue that connects renewables to climate change, support for the use of renewables is likely to become more polarized. Framing entails focusing on one or more aspects of an issue, which can shape how it is viewed and understood. How climate policies are framed, such as science, moral, and economic frames, can lead to more (less) support for those policies</w:t>
+        <w:t xml:space="preserve">. Therefore, if renewables are framed as an approach to address climate change, which becomes a cue that connects renewables to climate change, support for the use of renewables is likely to become more polarized. Framing entails focusing on one or more aspects of an issue, which can shape how it is perceived and understood, and a cue is a signal that brings a concept front of mind. How climate policies are framed, such as through science, moral, and economic frames, can lead to more (less) support for those policies</w:t>
       </w:r>
       <w:r>
         <w:t xml:space="preserve">(Severson and Coleman 2015)</w:t>
@@ -321,7 +321,7 @@
         <w:pStyle w:val="BodyText"/>
       </w:pPr>
       <w:r>
-        <w:t xml:space="preserve">The importance of framing in shaping public opinion has been demonstrated in studies that have found that a climate change cue can influence views on energy. For example, one study found that Republicans were less supportive of a carbon tax, fuel efficiency, and renewables when they were framed as a way to address climate change, compared to being framed as a way to address air pollution or energy security</w:t>
+        <w:t xml:space="preserve">The importance of framing in shaping public opinion has been demonstrated in studies that have found that climate change cues can influence views on energy. For example, one study found that Republicans were less supportive of a carbon tax, fuel efficiency, and renewables when they were framed as a way to address climate change compared to being framed as a way to address air pollution or energy security</w:t>
       </w:r>
       <w:r>
         <w:t xml:space="preserve"> </w:t>
@@ -374,7 +374,7 @@
         <w:pStyle w:val="BodyText"/>
       </w:pPr>
       <w:r>
-        <w:t xml:space="preserve">In addition to framing, elite cues can drive polarization among the public. Elites, such as prominent elected officials, political parties, and media figures, can influence public opinion and drive polarization. Indeed, elite cues may be one of the most important factors for public opinion about climate change</w:t>
+        <w:t xml:space="preserve">In addition to framing, elite cues can drive public polarization. Elites, such as prominent elected officials, political parties, and media figures, can influence public opinion and lead to polarization among the public. Indeed, elite cues may be one of the most important factors for public opinion about climate change</w:t>
       </w:r>
       <w:r>
         <w:t xml:space="preserve"> </w:t>
@@ -401,7 +401,7 @@
         <w:t xml:space="preserve">(Merkley and Stecula 2021)</w:t>
       </w:r>
       <w:r>
-        <w:t xml:space="preserve">. By taking a position on an issue, elites can bring attention to it and make it more salient, creating a signal for the public. This signal can lead to polarization, such as with the Green New Deal, which was widely popular but became polarized as a result of elite discourse</w:t>
+        <w:t xml:space="preserve">. By taking a position on an issue, elites can bring attention to it and make it more salient, creating a signal for the public to follow. This signal can lead to polarization, such as with the Green New Deal, which was widely popular but became polarized as a result of elite discourse</w:t>
       </w:r>
       <w:r>
         <w:t xml:space="preserve"> </w:t>
@@ -459,7 +459,7 @@
         <w:pStyle w:val="BodyText"/>
       </w:pPr>
       <w:r>
-        <w:t xml:space="preserve">No political figure in the last decade, or more, has done more to polarize the public than President Trump. The</w:t>
+        <w:t xml:space="preserve">It is likely that no political figure in the last decade has polarized the public more than President Trump. The</w:t>
       </w:r>
       <w:r>
         <w:t xml:space="preserve"> </w:t>
@@ -492,7 +492,7 @@
         <w:t xml:space="preserve">(Essig et al. 2021)</w:t>
       </w:r>
       <w:r>
-        <w:t xml:space="preserve">. Trump expressed skepticism about climate change even before running for the presidency. As a political candidate in 2016, he expressed support for fossil fuels, and during his first term, he withdrew the US from the Paris Agreement on climate change. However, since the start of his second administration, President Trump has accelerated efforts to bolster the production and use of fossil fuels while hindering the development of renewable energy sources</w:t>
+        <w:t xml:space="preserve">. Trump made comments suggesting his skepticism about climate change even before he ran for the presidency. As a political candidate in 2016, he expressed support for fossil fuels, and during his first term, he withdrew the US from the Paris Agreement on climate change. However, since the start of his second administration, President Trump has accelerated efforts to bolster the production and use of fossil fuels while hindering the development of renewable energy sources</w:t>
       </w:r>
       <w:r>
         <w:t xml:space="preserve"> </w:t>
@@ -527,7 +527,7 @@
         <w:pStyle w:val="FirstParagraph"/>
       </w:pPr>
       <w:r>
-        <w:t xml:space="preserve">The observed growing polarization on energy issues, most notably fossil fuels and renewables, could be a result of a climate change cue associated with those energy sources and/or a result of elite cues, particularly from President Trump, regarding these energy sources. To examine these possibilities, I posit the following hypotheses regarding the impact of climate and partisan cues on the public’s preferred energy mix of fossil fuels and renewable energy sources.</w:t>
+        <w:t xml:space="preserve">The observed growing polarization on energy issues, most notably fossil fuels and renewables, could be a result of a climate change cue associated with those energy sources and/or a result of elite cues, particularly from President Trump, regarding energy sources. To examine these possibilities, I posit the following hypotheses regarding the impact of climate and partisan cues on the public’s preferred energy mix of fossil fuels and renewable energy sources.</w:t>
       </w:r>
       <w:r>
         <w:rPr>
@@ -547,7 +547,14 @@
         <w:pStyle w:val="BlockText"/>
       </w:pPr>
       <w:r>
-        <w:t xml:space="preserve">Conservative Republicans who receive the</w:t>
+        <w:rPr>
+          <w:b/>
+          <w:bCs/>
+        </w:rPr>
+        <w:t xml:space="preserve">H1</w:t>
+      </w:r>
+      <w:r>
+        <w:t xml:space="preserve">: Conservative Republicans who receive the</w:t>
       </w:r>
       <w:r>
         <w:t xml:space="preserve"> </w:t>
@@ -603,7 +610,14 @@
         <w:pStyle w:val="BlockText"/>
       </w:pPr>
       <w:r>
-        <w:t xml:space="preserve">Conservative Republicans who receive the</w:t>
+        <w:rPr>
+          <w:b/>
+          <w:bCs/>
+        </w:rPr>
+        <w:t xml:space="preserve">H2</w:t>
+      </w:r>
+      <w:r>
+        <w:t xml:space="preserve">: Conservative Republicans who receive the</w:t>
       </w:r>
       <w:r>
         <w:t xml:space="preserve"> </w:t>
@@ -659,7 +673,14 @@
         <w:pStyle w:val="BlockText"/>
       </w:pPr>
       <w:r>
-        <w:t xml:space="preserve">Liberal Democrats who receive the</w:t>
+        <w:rPr>
+          <w:b/>
+          <w:bCs/>
+        </w:rPr>
+        <w:t xml:space="preserve">H3</w:t>
+      </w:r>
+      <w:r>
+        <w:t xml:space="preserve">: Liberal Democrats who receive the</w:t>
       </w:r>
       <w:r>
         <w:t xml:space="preserve"> </w:t>
@@ -715,7 +736,14 @@
         <w:pStyle w:val="BlockText"/>
       </w:pPr>
       <w:r>
-        <w:t xml:space="preserve">Liberal Democrats who receive the</w:t>
+        <w:rPr>
+          <w:b/>
+          <w:bCs/>
+        </w:rPr>
+        <w:t xml:space="preserve">H4</w:t>
+      </w:r>
+      <w:r>
+        <w:t xml:space="preserve">: Liberal Democrats who receive the</w:t>
       </w:r>
       <w:r>
         <w:t xml:space="preserve"> </w:t>
@@ -776,7 +804,7 @@
     </w:p>
     <w:bookmarkEnd w:id="11"/>
     <w:bookmarkEnd w:id="12"/>
-    <w:bookmarkStart w:id="14" w:name="research-design-and-measures"/>
+    <w:bookmarkStart w:id="13" w:name="research-design-and-measures"/>
     <w:p>
       <w:pPr>
         <w:pStyle w:val="Heading1"/>
@@ -790,7 +818,7 @@
         <w:pStyle w:val="FirstParagraph"/>
       </w:pPr>
       <w:r>
-        <w:t xml:space="preserve">To test the hypotheses, I use a 3 × 2 experimental design, where respondents were randomly assigned to one of three experimental conditions, including a Trump cue, a climate cue, and a control condition with no cues, which were compared across two types of political beliefs, including conservative Republicans and liberal Democrats. The preferred energy mix for producing electricity is the dependent variable and is measured as the percentage each respondent allocated across the five energy sources, including fossil fuels, wind, solar, hydro, and nuclear.</w:t>
+        <w:t xml:space="preserve">To test the hypotheses, I use a 3 × 2 experimental design, where respondents were randomly assigned to one of three experimental conditions, including a Trump cue, a climate cue, and a control condition with no cues. The impacts of the treatment conditions were compared across two types of political beliefs, including conservative Republicans and liberal Democrats. The preferred energy mix for producing electricity is the dependent variable and is measured as the percentage each respondent allocated across five energy sources, including fossil fuels, wind, solar, hydro, and nuclear.</w:t>
       </w:r>
     </w:p>
     <w:p>
@@ -805,7 +833,7 @@
         <w:t xml:space="preserve">Information</w:t>
       </w:r>
       <w:r>
-        <w:t xml:space="preserve">: As part of the research design, respondents were first given the current energy mix, as of 2024, the most recent year for which data were available, of the US related to electricity. Therefore, respondents were anchored to the actual energy mix used to produce electricity in the US.</w:t>
+        <w:t xml:space="preserve">: As part of the research design, respondents were first given the current energy mix of the US related to electricity as of 2024. Therefore, respondents were anchored to the actual energy mix used to produce electricity in the US.</w:t>
       </w:r>
     </w:p>
     <w:p>
@@ -821,7 +849,7 @@
         <w:pStyle w:val="FirstParagraph"/>
       </w:pPr>
       <w:r>
-        <w:t xml:space="preserve">Following this information, respondents were placed in one of three conditions and then asked about their preferred energy mix.</w:t>
+        <w:t xml:space="preserve">Following this information, respondents were placed in one of three conditions and asked about their preferred energy mix.</w:t>
       </w:r>
     </w:p>
     <w:p>
@@ -932,19 +960,7 @@
         <w:t xml:space="preserve">Energy mix</w:t>
       </w:r>
       <w:r>
-        <w:t xml:space="preserve">: Respondents indicated their preferred percentages for each energy source. Respondents were reminded of the current contributions of each source to the overall energy mix, and they were instructed that the total percentages must add to 100.</w:t>
-      </w:r>
-      <w:r>
-        <w:rPr>
-          <w:rStyle w:val="FootnoteReference"/>
-        </w:rPr>
-        <w:footnoteReference w:id="13"/>
-      </w:r>
-      <w:r>
-        <w:t xml:space="preserve"> </w:t>
-      </w:r>
-      <w:r>
-        <w:t xml:space="preserve">The question was worded as follows:</w:t>
+        <w:t xml:space="preserve">: Respondents indicated their preferred percentage for each energy source. Respondents were reminded of the current contributions of each source to the overall energy mix, and they were instructed that the total percentages must add up to 100. The question was worded as follows:</w:t>
       </w:r>
     </w:p>
     <w:p>
@@ -1000,11 +1016,11 @@
         <w:pStyle w:val="FirstParagraph"/>
       </w:pPr>
       <w:r>
-        <w:t xml:space="preserve">To measure political beliefs, respondents were asked with which political party they most identify and to place themselves on a 1 to 7 scale of political ideology, where 1 is strongly liberal, 4 is middle of the road, and 7 is strongly conservative. Responses were combined so that liberal Democrats were those who identified with the Democratic Party and were strongly liberal or liberal, and conservative Republicans were those who were Republicans and strongly conservative or conservative. Other political beliefs, including conservative Democrats, liberal Republicans, and moderate independents are the excluded referents.</w:t>
-      </w:r>
-    </w:p>
-    <w:bookmarkEnd w:id="14"/>
-    <w:bookmarkStart w:id="16" w:name="data"/>
+        <w:t xml:space="preserve">To measure political beliefs, respondents were asked with which political party they most identify and to place themselves on a 1 to 7 scale of political ideology, where 1 is strongly liberal, 4 is middle of the road, and 7 is strongly conservative. Responses were combined so that liberal Democrats were those who identified with the Democratic Party and were strongly liberal or liberal, and conservative Republicans were those who identified as Republicans and were strongly conservative or conservative. Other political beliefs, including conservative Democrats, liberal Republicans, and moderate independents are the excluded referents.</w:t>
+      </w:r>
+    </w:p>
+    <w:bookmarkEnd w:id="13"/>
+    <w:bookmarkStart w:id="15" w:name="data"/>
     <w:p>
       <w:pPr>
         <w:pStyle w:val="Heading1"/>
@@ -1018,7 +1034,7 @@
         <w:pStyle w:val="FirstParagraph"/>
       </w:pPr>
       <w:r>
-        <w:t xml:space="preserve">The data for this study comes from a survey of 3113 US residents recruited through Cloud Research, a survey panel provider that uses a variety of online recruitment methods to build a large and diverse panel of respondents. Cloud Research provides a quota-based sampling approach, in which US Census data are used to ensure representation across key demographic groups. The survey was internet-based and administered using QuestionPro, and was fielded from April 10 to April 15, 2026. Survey weights were applied to ensure that the sample was representative of the population. Respondents were randomly assigned to one of three conditions, and random assignment produced approximately equal groups, with the Trump cue,</w:t>
+        <w:t xml:space="preserve">The data for this study were obtained from a survey of 3113 US residents recruited through Cloud Research, a survey panel provider that uses various online recruitment methods to build a panel of respondents. Cloud Research provides a quota-based sampling approach in which US Census data are used to ensure representation across key demographic groups. The survey was internet-based and administered using QuestionPro and was fielded from April 10 to April 15, 2026. Survey weights were applied to ensure that the sample was representative of the US population. Respondents were randomly assigned to one of three conditions, and random assignment produced approximately equal groups, with the Trump cue,</w:t>
       </w:r>
       <w:r>
         <w:t xml:space="preserve"> </w:t>
@@ -1088,7 +1104,7 @@
         <w:rPr>
           <w:rStyle w:val="FootnoteReference"/>
         </w:rPr>
-        <w:footnoteReference w:id="15"/>
+        <w:footnoteReference w:id="14"/>
       </w:r>
     </w:p>
     <w:p>
@@ -1099,8 +1115,8 @@
         <w:t xml:space="preserve">In the next section, I first examine the cue questions to confirm that the respondents were responsive to the cues. Then, I examine the preferred energy mix by political beliefs and treatment conditions. Next, I test whether partisan gaps in the preferred energy mix differ significantly across treatment conditions. Finally, I explore the differences in the preferred energy sources from the current energy mix across treatment conditions and political beliefs.</w:t>
       </w:r>
     </w:p>
-    <w:bookmarkEnd w:id="16"/>
-    <w:bookmarkStart w:id="36" w:name="results"/>
+    <w:bookmarkEnd w:id="15"/>
+    <w:bookmarkStart w:id="35" w:name="results"/>
     <w:p>
       <w:pPr>
         <w:pStyle w:val="Heading1"/>
@@ -1147,7 +1163,20 @@
       <w:tr>
         <w:tc>
           <w:tcPr/>
-          <w:bookmarkStart w:id="20" w:name="fig-cueModels"/>
+          <w:bookmarkStart w:id="19" w:name="fig-cueModels"/>
+          <w:p>
+            <w:pPr>
+              <w:jc w:val="center"/>
+            </w:pPr>
+            <w:pPr>
+              <w:jc w:val="left"/>
+              <w:spacing w:before="200"/>
+              <w:pStyle w:val="ImageCaption"/>
+            </w:pPr>
+            <w:r>
+              <w:t xml:space="preserve">Figure 1: Coefficient Plots of Trump Cue and Climate Cue</w:t>
+            </w:r>
+          </w:p>
           <w:p>
             <w:pPr>
               <w:pStyle w:val="Compact"/>
@@ -1158,18 +1187,18 @@
                 <wp:inline>
                   <wp:extent cx="5334000" cy="4262437"/>
                   <wp:effectExtent b="0" l="0" r="0" t="0"/>
-                  <wp:docPr descr="" title="" id="18" name="Picture"/>
+                  <wp:docPr descr="" title="" id="17" name="Picture"/>
                   <a:graphic>
                     <a:graphicData uri="http://schemas.openxmlformats.org/drawingml/2006/picture">
                       <pic:pic>
                         <pic:nvPicPr>
-                          <pic:cNvPr descr="cue-energy_files/figure-docx/fig-cueModels-1.png" id="19" name="Picture"/>
+                          <pic:cNvPr descr="cue-energy_files/figure-docx/fig-cueModels-1.png" id="18" name="Picture"/>
                           <pic:cNvPicPr>
                             <a:picLocks noChangeArrowheads="1" noChangeAspect="1"/>
                           </pic:cNvPicPr>
                         </pic:nvPicPr>
                         <pic:blipFill>
-                          <a:blip r:embed="rId17"/>
+                          <a:blip r:embed="rId16"/>
                           <a:stretch>
                             <a:fillRect/>
                           </a:stretch>
@@ -1196,20 +1225,7 @@
               </w:drawing>
             </w:r>
           </w:p>
-          <w:p>
-            <w:pPr>
-              <w:jc w:val="center"/>
-            </w:pPr>
-            <w:pPr>
-              <w:jc w:val="left"/>
-              <w:spacing w:before="200"/>
-              <w:pStyle w:val="ImageCaption"/>
-            </w:pPr>
-            <w:r>
-              <w:t xml:space="preserve">Figure 1: Coefficient Plots of Trump Cue and Climate Cue</w:t>
-            </w:r>
-          </w:p>
-          <w:bookmarkEnd w:id="20"/>
+          <w:bookmarkEnd w:id="19"/>
         </w:tc>
       </w:tr>
     </w:tbl>
@@ -1218,7 +1234,7 @@
         <w:pStyle w:val="BodyText"/>
       </w:pPr>
       <w:r>
-        <w:t xml:space="preserve">As shown, for the Trump cue liberal democrats were significantly less likely, at -0.753, to support Trump’s actions on energy, whereas conservative Republicans had an estimated level of support 1.416 points higher on the 1 to 5 scale than other political beliefs. For the climate change cue, liberal Democrats were significantly more likely than others to support renewable energy to address climate change, with an estimated coefficient of 0.556, and conservative Republicans were significantly less likely, with a coefficient of -0.663. These results suggest that respondents were responsive to the cues in ways that were expected.</w:t>
+        <w:t xml:space="preserve">As shown, for the Trump cue, liberal democrats were significantly less likely, at -0.753, to support Trump’s actions on energy, whereas conservative Republicans had an estimated level of support 1.416 points higher on the 1 to 5 scale than other political beliefs. For the climate change cue, liberal Democrats were significantly more likely than others to support renewable energy to address climate change, with an estimated coefficient of 0.556, and conservative Republicans were significantly less likely, with a coefficient of -0.663. These results suggest that the respondents were responsive to the cues in the expected ways.</w:t>
       </w:r>
     </w:p>
     <w:p>
@@ -1226,7 +1242,7 @@
         <w:pStyle w:val="BodyText"/>
       </w:pPr>
       <w:r>
-        <w:t xml:space="preserve">Next, I examine the differences in the predicted preferred energy mix across treatments and political beliefs. The results are shown in</w:t>
+        <w:t xml:space="preserve">Next, I examine the differences in the predicted preferred energy mix across the treatments and political beliefs. The results are shown in</w:t>
       </w:r>
       <w:r>
         <w:t xml:space="preserve"> </w:t>
@@ -1256,7 +1272,20 @@
       <w:tr>
         <w:tc>
           <w:tcPr/>
-          <w:bookmarkStart w:id="24" w:name="fig-pred"/>
+          <w:bookmarkStart w:id="23" w:name="fig-pred"/>
+          <w:p>
+            <w:pPr>
+              <w:jc w:val="center"/>
+            </w:pPr>
+            <w:pPr>
+              <w:jc w:val="left"/>
+              <w:spacing w:before="200"/>
+              <w:pStyle w:val="ImageCaption"/>
+            </w:pPr>
+            <w:r>
+              <w:t xml:space="preserve">Figure 2: Predicted Preferred Energy Mix by Political Beliefs and Cues</w:t>
+            </w:r>
+          </w:p>
           <w:p>
             <w:pPr>
               <w:pStyle w:val="Compact"/>
@@ -1267,18 +1296,18 @@
                 <wp:inline>
                   <wp:extent cx="5334000" cy="4262437"/>
                   <wp:effectExtent b="0" l="0" r="0" t="0"/>
-                  <wp:docPr descr="" title="" id="22" name="Picture"/>
+                  <wp:docPr descr="" title="" id="21" name="Picture"/>
                   <a:graphic>
                     <a:graphicData uri="http://schemas.openxmlformats.org/drawingml/2006/picture">
                       <pic:pic>
                         <pic:nvPicPr>
-                          <pic:cNvPr descr="cue-energy_files/figure-docx/fig-pred-1.png" id="23" name="Picture"/>
+                          <pic:cNvPr descr="cue-energy_files/figure-docx/fig-pred-1.png" id="22" name="Picture"/>
                           <pic:cNvPicPr>
                             <a:picLocks noChangeArrowheads="1" noChangeAspect="1"/>
                           </pic:cNvPicPr>
                         </pic:nvPicPr>
                         <pic:blipFill>
-                          <a:blip r:embed="rId21"/>
+                          <a:blip r:embed="rId20"/>
                           <a:stretch>
                             <a:fillRect/>
                           </a:stretch>
@@ -1305,20 +1334,7 @@
               </w:drawing>
             </w:r>
           </w:p>
-          <w:p>
-            <w:pPr>
-              <w:jc w:val="center"/>
-            </w:pPr>
-            <w:pPr>
-              <w:jc w:val="left"/>
-              <w:spacing w:before="200"/>
-              <w:pStyle w:val="ImageCaption"/>
-            </w:pPr>
-            <w:r>
-              <w:t xml:space="preserve">Figure 2: Predicted Preferred Energy Mix by Political Beliefs and Cues</w:t>
-            </w:r>
-          </w:p>
-          <w:bookmarkEnd w:id="24"/>
+          <w:bookmarkEnd w:id="23"/>
         </w:tc>
       </w:tr>
     </w:tbl>
@@ -1327,7 +1343,7 @@
         <w:pStyle w:val="BodyText"/>
       </w:pPr>
       <w:r>
-        <w:t xml:space="preserve">As can be seen, conservative Republicans preferred an energy mix with more fossil fuels than liberal Democrats, particularly Republicans who received the Trump cue. Conservative Republicans in the Trump condition preferred an energy mix that consisted of approximately 41% fossil fuels compared to 31% in both the climate and control conditions. Liberal Democrats preferred an energy mix with more renewables than Republicans, particularly wind and solar, and the percentages of renewable sources were largely consistent for Democrats across the three conditions. Finally, Republicans preferred more nuclear energy than Democrats across all conditions, but the differences were smallest in the Trump condition.</w:t>
+        <w:t xml:space="preserve">As can be seen, conservative Republicans preferred an energy mix with more fossil fuels than liberal Democrats, particularly those who received the Trump cue. Conservative Republicans in the Trump condition preferred an energy mix that consisted of approximately 41% fossil fuels, compared to 31% in both the climate and control conditions. Liberal Democrats preferred an energy mix with more renewables than Republicans, particularly wind and solar, and the percentages of renewable sources were largely consistent for Democrats across all three conditions. Finally, Republicans preferred more nuclear energy than Democrats across all conditions, but the differences were smallest in the Trump condition.</w:t>
       </w:r>
     </w:p>
     <w:p>
@@ -1335,7 +1351,7 @@
         <w:pStyle w:val="BodyText"/>
       </w:pPr>
       <w:r>
-        <w:t xml:space="preserve">Next, I illustrate the polarization of energy preferences across beliefs and cues by sorting the gaps by size and direction, and they are shown in</w:t>
+        <w:t xml:space="preserve">Next, I illustrate the polarization of energy preferences across beliefs and cues by sorting the gaps by size and direction, and the results are shown in</w:t>
       </w:r>
       <w:r>
         <w:t xml:space="preserve"> </w:t>
@@ -1349,7 +1365,7 @@
         </w:r>
       </w:hyperlink>
       <w:r>
-        <w:t xml:space="preserve">. As shown, fossil fuels are the most polarized, particularly in the Trump condition, with an average difference of 23.5 percentage points between liberal Democrats and conservative Republicans. In the climate condition, the gap was 18.1, and it was 16.1 in the control. Following fossil fuels, wind and solar energy are the next most polarized and preferred by liberal Democrats, roughly equally across all three conditions. For wind, the gap between the parties ranged from 11 to 12 points, and the gaps for solar were similar, with a range of 10 to 12 points. Nuclear energy shows some polarization, with conservative Republicans more supportive than liberal Democrats, and the gaps ranged from 4 to 8 points. Finally, hydro was the least polarized, with gaps of only 2–4 percentage points.</w:t>
+        <w:t xml:space="preserve">. As shown, fossil fuels are the most polarized, particularly in the Trump condition, with an average difference of 23.5 percentage points between liberal Democrats and conservative Republicans. In the climate condition, the gap was 18.1, and it was 16.1 in the control. Following fossil fuels, wind and solar energy are the next most polarized and preferred by liberal Democrats, roughly equally across all three conditions. For wind, the gap between the parties ranged from 11 to 12 points across the conditions, and the gaps for solar were similar, with a range of 10 to 12 points. Nuclear energy shows some polarization, with conservative Republicans more supportive than liberal Democrats, with gaps ranging from 4 to 8 points. Finally, hydro was the least polarized, with gaps of only 2–4 percentage points.</w:t>
       </w:r>
     </w:p>
     <w:tbl>
@@ -1365,7 +1381,20 @@
       <w:tr>
         <w:tc>
           <w:tcPr/>
-          <w:bookmarkStart w:id="28" w:name="fig-gap"/>
+          <w:bookmarkStart w:id="27" w:name="fig-gap"/>
+          <w:p>
+            <w:pPr>
+              <w:jc w:val="center"/>
+            </w:pPr>
+            <w:pPr>
+              <w:jc w:val="left"/>
+              <w:spacing w:before="200"/>
+              <w:pStyle w:val="ImageCaption"/>
+            </w:pPr>
+            <w:r>
+              <w:t xml:space="preserve">Figure 3: Polarization in the Preferred Energy Mix</w:t>
+            </w:r>
+          </w:p>
           <w:p>
             <w:pPr>
               <w:pStyle w:val="Compact"/>
@@ -1376,18 +1405,18 @@
                 <wp:inline>
                   <wp:extent cx="5334000" cy="4262437"/>
                   <wp:effectExtent b="0" l="0" r="0" t="0"/>
-                  <wp:docPr descr="" title="" id="26" name="Picture"/>
+                  <wp:docPr descr="" title="" id="25" name="Picture"/>
                   <a:graphic>
                     <a:graphicData uri="http://schemas.openxmlformats.org/drawingml/2006/picture">
                       <pic:pic>
                         <pic:nvPicPr>
-                          <pic:cNvPr descr="cue-energy_files/figure-docx/fig-gap-1.png" id="27" name="Picture"/>
+                          <pic:cNvPr descr="cue-energy_files/figure-docx/fig-gap-1.png" id="26" name="Picture"/>
                           <pic:cNvPicPr>
                             <a:picLocks noChangeArrowheads="1" noChangeAspect="1"/>
                           </pic:cNvPicPr>
                         </pic:nvPicPr>
                         <pic:blipFill>
-                          <a:blip r:embed="rId25"/>
+                          <a:blip r:embed="rId24"/>
                           <a:stretch>
                             <a:fillRect/>
                           </a:stretch>
@@ -1414,20 +1443,7 @@
               </w:drawing>
             </w:r>
           </w:p>
-          <w:p>
-            <w:pPr>
-              <w:jc w:val="center"/>
-            </w:pPr>
-            <w:pPr>
-              <w:jc w:val="left"/>
-              <w:spacing w:before="200"/>
-              <w:pStyle w:val="ImageCaption"/>
-            </w:pPr>
-            <w:r>
-              <w:t xml:space="preserve">Figure 3: Largest Gaps by Political Belief in Preferred Energy Mix</w:t>
-            </w:r>
-          </w:p>
-          <w:bookmarkEnd w:id="28"/>
+          <w:bookmarkEnd w:id="27"/>
         </w:tc>
       </w:tr>
     </w:tbl>
@@ -1466,7 +1482,7 @@
       <w:tr>
         <w:tc>
           <w:tcPr/>
-          <w:bookmarkStart w:id="29" w:name="tbl-pred-contrasts"/>
+          <w:bookmarkStart w:id="28" w:name="tbl-pred-contrasts"/>
           <w:p>
             <w:pPr>
               <w:jc w:val="center"/>
@@ -4840,13 +4856,13 @@
                       <w:szCs w:val="14"/>
                       <w:color w:val="000000"/>
                     </w:rPr>
-                    <w:t xml:space="preserve">Note: Cell entries are estimated differences in the predicted preferred share (percentage points) underlying Figure 2. Partisan-gap rows are the Liberal Democrats − Conservative Republicans difference within each condition; within-party rows are the change for that party when moving from one condition to another (positive = the later condition is higher). Estimates use survey weights; standard errors and p-values are design-based. *** p &lt; 0.001, ** p &lt; 0.01, * p &lt; 0.05, † p &lt; 0.10.</w:t>
+                    <w:t xml:space="preserve">Note: Cell entries are estimated differences in the predicted preferred share (percentage points) underlying Figure 2. Partisan-gap rows are the Liberal Democrats − Conservative Republicans difference within each condition; within-party rows are the change for that party when moving from one condition to another. Estimates use survey weights; standard errors and p-values are design-based. *** p &lt; 0.001, ** p &lt; 0.01, * p &lt; 0.05, † p &lt; 0.10.</w:t>
                   </w:r>
                 </w:p>
               </w:tc>
             </w:tr>
           </w:tbl>
-          <w:bookmarkEnd w:id="29"/>
+          <w:bookmarkEnd w:id="28"/>
         </w:tc>
       </w:tr>
     </w:tbl>
@@ -4889,7 +4905,7 @@
         <w:t xml:space="preserve"> </w:t>
       </w:r>
       <w:r>
-        <w:t xml:space="preserve">are statistically significant for every energy source under every condition. This means that liberal Democrats and conservative Republicans differ in their preferred mix, regardless of the experimental condition. In terms of the hypotheses, as expected conservative Republicans in the Trump condition preferred 9.5 percentage points (p &lt; 0.001) more fossil fuels, and less renewables with 2.4 percentage points (p = 0.046) less wind, 3.4 percentage points (p = 0.017) less solar, and 1.6 percentage points (p = 0.100) less hydro than those in the control condition. Additionally, as expected, they preferred more fossil fuels, at 9.4 percentage points (p &lt; 0.001), and less wind, with 3.1 percentage points (p = 0.011) in the Trump condition versus the climate condition. However, contrary to expectations, conservative Republicans were no more or less likely to prefer fossil fuels or oppose renewables in the climate change condition than in the control condition.</w:t>
+        <w:t xml:space="preserve">are statistically significant for each energy source under every condition. This means that liberal Democrats and conservative Republicans differ in their preferred mix, regardless of the experimental treatment. In terms of the hypotheses, as expected (H1), conservative Republicans in the Trump condition preferred 9.5 percentage points (p &lt; 0.001) more fossil fuels, and less renewables with 2.4 percentage points (p = 0.046) less wind, 3.4 percentage points (p = 0.017) less solar, and 1.6 percentage points (p = 0.100) less hydro than those in the control condition. Additionally, as expected, they preferred more fossil fuels, at 9.4 percentage points (p &lt; 0.001), and less wind, with 3.1 percentage points (p = 0.011) in the Trump condition versus the climate condition. However, contrary to expectations (H2), conservative Republicans were no more or less likely to prefer fossil fuels or oppose renewables in the climate change condition than in the control condition.</w:t>
       </w:r>
     </w:p>
     <w:p>
@@ -4911,7 +4927,7 @@
         </w:r>
       </w:hyperlink>
       <w:r>
-        <w:t xml:space="preserve">, overall, liberal Democrats preferred more wind and solar energy and less fossil fuels and nuclear energy than Republicans across all conditions. However, contrary to expectations regarding renewable energy, liberal Democrats only preferred more hydro, at 1.6 percentage points (p = 0.018) in the climate condition compared to the control. Compared to the climate condition, liberal Democrats in the Trump condition preferred 4.0 percentage points (p &lt; 0.001) more fossil fuels, 1.8 percentage points (p = 0.065) less wind, and 1.4 percentage points (p = 0.036) less hydro. Similarly, compared to the control condition, liberal Democrats in the Trump condition preferred more fossil fuels, at 2.2 percentage points (p = 0.072) and 1.7 percentage points (p = 0.085) less hydro. However, the shifts for liberal Democrats were much smaller than those for conservative Republicans, and the shifts for Democrats in the Trump condition compared to the control were significant at p &lt; 0.10.</w:t>
+        <w:t xml:space="preserve">, overall, liberal Democrats preferred more wind, solar, and hydro and less fossil fuels and nuclear energy than Republicans across all conditions. However, contrary to expectations regarding the climate cue and renewable energy (H4), liberal Democrats only preferred more hydro, at 1.6 percentage points (p = 0.018) in the climate condition compared to the control. Compared to the climate condition, liberal Democrats in the Trump condition preferred 4.0 percentage points (p &lt; 0.001) more fossil fuels, 1.8 percentage points (p = 0.065) less wind, and 1.4 percentage points (p = 0.036) less hydro. Similarly, compared to the control condition, liberal Democrats in the Trump condition preferred more fossil fuels, at 2.2 percentage points (p = 0.072) and 1.7 percentage points (p = 0.085) less hydro, in contrast to H3. However, the shifts for liberal Democrats were much smaller than those for conservative Republicans, and the shifts for Democrats in the Trump condition compared to the control were significant, but at p &lt; 0.10.</w:t>
       </w:r>
     </w:p>
     <w:p>
@@ -4919,24 +4935,7 @@
         <w:pStyle w:val="BodyText"/>
       </w:pPr>
       <w:r>
-        <w:t xml:space="preserve">Nuclear was supported more by Republicans than by Democrats and was most polarized in the climate and control conditions. No within-party differences across the conditions were significant for nuclear energy. Overall, hydro was preferred by liberal Democrats; however, as noted, it was the least polarized energy source. The hydro power control condition had the smallest gap, with a difference of only about 2 percentage points. Liberal Democrats in the climate cue condition preferred 1.6 percentage points (p = 0.018) more hydro than those in the control condition. Together, these results show that the cue-driven movement in</w:t>
-      </w:r>
-      <w:r>
-        <w:t xml:space="preserve"> </w:t>
-      </w:r>
-      <w:hyperlink w:anchor="fig-pred">
-        <w:r>
-          <w:rPr>
-            <w:rStyle w:val="Hyperlink"/>
-          </w:rPr>
-          <w:t xml:space="preserve">Figure 2</w:t>
-        </w:r>
-      </w:hyperlink>
-      <w:r>
-        <w:t xml:space="preserve"> </w:t>
-      </w:r>
-      <w:r>
-        <w:t xml:space="preserve">is largely driven by conservative Republicans responding to the Trump cue.</w:t>
+        <w:t xml:space="preserve">While I didn’t posit any hypotheses regarding nuclear energy, the results show that it was supported more by Republicans than by Democrats and was most polarized in the climate and control conditions. However, no within-party differences across the conditions were significant for nuclear energy. Also of note is that hydropower was the least polarized energy source. Hydropower in the control condition had the smallest gap between the parties, with a difference of only about 2 percentage points. Together, these results show that polarization is largely a result of conservative Republicans responding to the Trump cue and the strong support for wind and solar of liberal Democrats regardless of treatment.</w:t>
       </w:r>
     </w:p>
     <w:p>
@@ -4944,7 +4943,7 @@
         <w:pStyle w:val="BodyText"/>
       </w:pPr>
       <w:r>
-        <w:t xml:space="preserve">Next, I compare the gaps across treatment conditions to examine whether the cues shifted partisan differences in the preferred energy mix. Specifically, I use a difference-in-differences (DiD) approach, where I examine the difference between political beliefs (i.e., liberal Democrats - conservative Republicans), which are shown in</w:t>
+        <w:t xml:space="preserve">Next, I compare the gaps across the treatment conditions to examine whether the cues shifted partisan differences in the preferred energy mix. Specifically, I use a difference-in-differences (DiD) approach to examine the difference between political beliefs (i.e., liberal Democrats - conservative Republicans), which are shown in</w:t>
       </w:r>
       <w:r>
         <w:t xml:space="preserve"> </w:t>
@@ -4958,13 +4957,30 @@
         </w:r>
       </w:hyperlink>
       <w:r>
+        <w:t xml:space="preserve"> </w:t>
+      </w:r>
+      <w:r>
+        <w:t xml:space="preserve">and</w:t>
+      </w:r>
+      <w:r>
+        <w:t xml:space="preserve"> </w:t>
+      </w:r>
+      <w:hyperlink w:anchor="tbl-pred-contrasts">
+        <w:r>
+          <w:rPr>
+            <w:rStyle w:val="Hyperlink"/>
+          </w:rPr>
+          <w:t xml:space="preserve">Table 1</w:t>
+        </w:r>
+      </w:hyperlink>
+      <w:r>
         <w:t xml:space="preserve">, and the differences between treatment conditions (e.g., Trump cue - control) using interaction terms between political beliefs and treatment conditions.</w:t>
       </w:r>
       <w:r>
         <w:rPr>
           <w:rStyle w:val="FootnoteReference"/>
         </w:rPr>
-        <w:footnoteReference w:id="30"/>
+        <w:footnoteReference w:id="29"/>
       </w:r>
       <w:r>
         <w:t xml:space="preserve"> </w:t>
@@ -5000,7 +5016,7 @@
       <w:tr>
         <w:tc>
           <w:tcPr/>
-          <w:bookmarkStart w:id="31" w:name="tbl-did"/>
+          <w:bookmarkStart w:id="30" w:name="tbl-did"/>
           <w:p>
             <w:pPr>
               <w:jc w:val="center"/>
@@ -5011,7 +5027,7 @@
               <w:pStyle w:val="ImageCaption"/>
             </w:pPr>
             <w:r>
-              <w:t xml:space="preserve">Table 2: Treatment Effects on the Preferred Energy Mix Across Political Beliefs</w:t>
+              <w:t xml:space="preserve">Table 2: Treatment Effects on the Polarization of Preferred Energy Sources</w:t>
             </w:r>
           </w:p>
           <w:tbl xmlns:w="http://schemas.openxmlformats.org/wordprocessingml/2006/main" xmlns:r="http://schemas.openxmlformats.org/officeDocument/2006/relationships" xmlns:w14="http://schemas.microsoft.com/office/word/2010/wordml" xmlns:wp="http://schemas.openxmlformats.org/drawingml/2006/wordprocessingDrawing" xmlns:a="http://schemas.openxmlformats.org/drawingml/2006/main" xmlns:pic="http://schemas.openxmlformats.org/drawingml/2006/picture">
@@ -6735,7 +6751,7 @@
               </w:tc>
             </w:tr>
           </w:tbl>
-          <w:bookmarkEnd w:id="31"/>
+          <w:bookmarkEnd w:id="30"/>
         </w:tc>
       </w:tr>
     </w:tbl>
@@ -6755,7 +6771,7 @@
         <w:t xml:space="preserve"> </w:t>
       </w:r>
       <w:r>
-        <w:t xml:space="preserve">illustrates the change in the partisan gap for each energy source across each pairwise treatment comparison. Additionally,</w:t>
+        <w:t xml:space="preserve">illustrates the additional shift in the partisan gap as a result of a cue, relative to the comparison condition. For example, with fossil fuels the partisan gap was 15.0 − 31.1 = -16.1 percentage points in the control condition and 17.2 − 40.6 = -23.5 percentage points in the Trump condition. The difference of that difference, -7.3 percentage points, is what is shown in</w:t>
       </w:r>
       <w:r>
         <w:t xml:space="preserve"> </w:t>
@@ -6769,10 +6785,46 @@
         </w:r>
       </w:hyperlink>
       <w:r>
-        <w:t xml:space="preserve"> </w:t>
-      </w:r>
-      <w:r>
-        <w:t xml:space="preserve">includes an omnibus F-test that examines whether the cues had an overall effect on the partisan gaps across each energy source. As can be seen, for fossil fuels, the F-test was significant, indicating that the partisan gaps in the preferred energy mix shifted significantly for fossil fuels. These impacts were a result of the Trump condition, as a shift of -7.3 percentage points occurred between the Trump and control conditions, and a shift of -5.4 percentage points occurred between the Trump and climate change conditions. Additionally, the gap for hydropower was significantly higher (at</w:t>
+        <w:t xml:space="preserve">. Note that the differences between the parties are calculated by subtracting the preferred percentage for conservative Republicans from that of liberal Democrats for each sources. So, similar to</w:t>
+      </w:r>
+      <w:r>
+        <w:t xml:space="preserve"> </w:t>
+      </w:r>
+      <w:hyperlink w:anchor="tbl-pred-contrasts">
+        <w:r>
+          <w:rPr>
+            <w:rStyle w:val="Hyperlink"/>
+          </w:rPr>
+          <w:t xml:space="preserve">Table 1</w:t>
+        </w:r>
+      </w:hyperlink>
+      <w:r>
+        <w:t xml:space="preserve">, a negative sign indicates that Republicans preferred that source more than Democrats.</w:t>
+      </w:r>
+    </w:p>
+    <w:p>
+      <w:pPr>
+        <w:pStyle w:val="BodyText"/>
+      </w:pPr>
+      <w:r>
+        <w:t xml:space="preserve">Additionally,</w:t>
+      </w:r>
+      <w:r>
+        <w:t xml:space="preserve"> </w:t>
+      </w:r>
+      <w:hyperlink w:anchor="tbl-did">
+        <w:r>
+          <w:rPr>
+            <w:rStyle w:val="Hyperlink"/>
+          </w:rPr>
+          <w:t xml:space="preserve">Table 2</w:t>
+        </w:r>
+      </w:hyperlink>
+      <w:r>
+        <w:t xml:space="preserve"> </w:t>
+      </w:r>
+      <w:r>
+        <w:t xml:space="preserve">includes an omnibus F-test that examines whether the cues had an overall effect on partisan gaps across each energy source. As can be seen, the F-test was only significant for fossil fuels, indicating that the partisan gaps in the preferred energy mix shifted significantly for those energy sources. These impacts were a result of the Trump condition, as the gap increased by -7.3 percentage points between the Trump and control conditions and a shift of -5.4 percentage points occurred between the Trump and climate change conditions. Also, the gap for hydropower was significantly higher (at</w:t>
       </w:r>
       <w:r>
         <w:t xml:space="preserve"> </w:t>
@@ -6785,7 +6837,7 @@
         <w:t xml:space="preserve">p</w:t>
       </w:r>
       <w:r>
-        <w:t xml:space="preserve">&lt;0.10) in the climate condition than in the control condition.</w:t>
+        <w:t xml:space="preserve">&lt;0.10) in the climate condition than in the control condition, likely because of the shift among liberal Democrats.</w:t>
       </w:r>
     </w:p>
     <w:p>
@@ -6799,7 +6851,7 @@
         <w:t xml:space="preserve"> </w:t>
       </w:r>
       <w:r>
-        <w:t xml:space="preserve">(Hawes and Nowlin 2022; Ter-Mkrtchyan et al. 2022)</w:t>
+        <w:t xml:space="preserve">(Bergquist, Konisky, and Kotcher 2020; Hawes and Nowlin 2022; Ter-Mkrtchyan et al. 2022)</w:t>
       </w:r>
       <w:r>
         <w:t xml:space="preserve">. Therefore, I compare the differences in preferred energy sources from the current baseline across political beliefs and treatment conditions in</w:t>
@@ -6832,7 +6884,20 @@
       <w:tr>
         <w:tc>
           <w:tcPr/>
-          <w:bookmarkStart w:id="35" w:name="fig-mixchange"/>
+          <w:bookmarkStart w:id="34" w:name="fig-mixchange"/>
+          <w:p>
+            <w:pPr>
+              <w:jc w:val="center"/>
+            </w:pPr>
+            <w:pPr>
+              <w:jc w:val="left"/>
+              <w:spacing w:before="200"/>
+              <w:pStyle w:val="ImageCaption"/>
+            </w:pPr>
+            <w:r>
+              <w:t xml:space="preserve">Figure 4: Preferred Change from Existing Energy Mix (percentage points)</w:t>
+            </w:r>
+          </w:p>
           <w:p>
             <w:pPr>
               <w:pStyle w:val="Compact"/>
@@ -6843,18 +6908,18 @@
                 <wp:inline>
                   <wp:extent cx="5334000" cy="4262437"/>
                   <wp:effectExtent b="0" l="0" r="0" t="0"/>
-                  <wp:docPr descr="" title="" id="33" name="Picture"/>
+                  <wp:docPr descr="" title="" id="32" name="Picture"/>
                   <a:graphic>
                     <a:graphicData uri="http://schemas.openxmlformats.org/drawingml/2006/picture">
                       <pic:pic>
                         <pic:nvPicPr>
-                          <pic:cNvPr descr="cue-energy_files/figure-docx/fig-mixchange-1.png" id="34" name="Picture"/>
+                          <pic:cNvPr descr="cue-energy_files/figure-docx/fig-mixchange-1.png" id="33" name="Picture"/>
                           <pic:cNvPicPr>
                             <a:picLocks noChangeArrowheads="1" noChangeAspect="1"/>
                           </pic:cNvPicPr>
                         </pic:nvPicPr>
                         <pic:blipFill>
-                          <a:blip r:embed="rId32"/>
+                          <a:blip r:embed="rId31"/>
                           <a:stretch>
                             <a:fillRect/>
                           </a:stretch>
@@ -6881,20 +6946,7 @@
               </w:drawing>
             </w:r>
           </w:p>
-          <w:p>
-            <w:pPr>
-              <w:jc w:val="center"/>
-            </w:pPr>
-            <w:pPr>
-              <w:jc w:val="left"/>
-              <w:spacing w:before="200"/>
-              <w:pStyle w:val="ImageCaption"/>
-            </w:pPr>
-            <w:r>
-              <w:t xml:space="preserve">Figure 4: Preferred Change from Existing Energy Mix (percentage points)</w:t>
-            </w:r>
-          </w:p>
-          <w:bookmarkEnd w:id="35"/>
+          <w:bookmarkEnd w:id="34"/>
         </w:tc>
       </w:tr>
     </w:tbl>
@@ -6903,7 +6955,7 @@
         <w:pStyle w:val="BodyText"/>
       </w:pPr>
       <w:r>
-        <w:t xml:space="preserve">As shown, all respondents wanted an energy mix with fewer fossil fuels and more renewables. When comparing each group’s predicted preferred share to the status quo, the preferred changes were statistically significant for 29 of the 30 group-by-source-by-condition comparisons. Both liberal Democrats and conservative Republicans preferred significantly less fossil fuel and significantly more wind, solar, and hydropower than the current mix across all three conditions, with Democrats favoring larger shifts away from fossil fuels and toward renewables than Republicans did. These findings support previous research suggesting that the public, including conservative Republicans, generally supports a transition to renewable energy sources. Additionally, the cues had little effect on the preferred change from the current mix for most sources, except for fossil fuels, where the Trump cue led conservative Republicans to prefer a smaller reduction in fossil fuels, -17.4, than they did in the control with -26.9, and climate conditions at -26.8.</w:t>
+        <w:t xml:space="preserve">As shown, all respondents wanted an energy mix with fewer fossil fuels and more renewable energy sources. When comparing each group’s predicted preferred share to the status quo, the preferred changes were statistically significant for 29 of the 30 group-by-source-by-condition comparisons. Both liberal Democrats and conservative Republicans preferred significantly less fossil fuel and significantly more wind, solar, and hydropower than the current mix across all three conditions, with Democrats favoring larger shifts away from fossil fuels and toward renewables than Republicans. These findings support previous research suggesting that the public generally supports a transition to renewable energy sources. Additionally, the cues had little effect on the preferred change from the current mix for most sources, except for fossil fuels, where the Trump cue led conservative Republicans to prefer a smaller reduction in fossil fuels, -17.4, than they did in the control with -26.9, or climate condition at -26.8.</w:t>
       </w:r>
     </w:p>
     <w:p>
@@ -6911,11 +6963,11 @@
         <w:pStyle w:val="BodyText"/>
       </w:pPr>
       <w:r>
-        <w:t xml:space="preserve">The two parties diverge only on nuclear energy, with liberal Democrats preferring a small but significant reduction (about three percentage points), whereas conservative Republicans prefer an expansion in the control and climate conditions. The only non-significant difference is conservative Republicans’ preferred nuclear share in the Trump condition, which is statistically indistinguishable from the current level (a change of 1.3 percentage points, with a 95% confidence interval that includes zero).</w:t>
-      </w:r>
-    </w:p>
-    <w:bookmarkEnd w:id="36"/>
-    <w:bookmarkStart w:id="37" w:name="discussion"/>
+        <w:t xml:space="preserve">The two parties diverge only on nuclear energy, with liberal Democrats preferring a small but significant reduction (about three percentage points), whereas conservative Republicans prefer an expansion in the control and climate conditions. The only non-significant difference is conservative Republicans’ preferred nuclear share in the Trump condition, with an estimated change of only 1.3 percentage points from the current baseline.</w:t>
+      </w:r>
+    </w:p>
+    <w:bookmarkEnd w:id="35"/>
+    <w:bookmarkStart w:id="36" w:name="discussion"/>
     <w:p>
       <w:pPr>
         <w:pStyle w:val="Heading1"/>
@@ -6952,7 +7004,7 @@
         <w:t xml:space="preserve">Fossil fuels</w:t>
       </w:r>
       <w:r>
-        <w:t xml:space="preserve">: As expected, conservative Republicans in the Trump condition preferred more fossil fuels than those in the control or climate conditions. In addition, across energy sources, the largest partisan gaps were for fossil fuels, with a 16.1 percentage point gap in the control condition, a 18.1 percentage point gap in the climate condition, and a 23.5 percentage point gap in the Trump condition. Looking at within-party differences, conservative Republicans in the Trump condition preferred 9.5 percentage points more fossil fuels than those in the control, and 9.4 more than those in the climate condition. Significant differences existed between political beliefs for fossil fuels, as shown in the omnibus F-test in</w:t>
+        <w:t xml:space="preserve">: As expected, conservative Republicans in the Trump condition preferred more fossil fuels than those in the control or climate conditions. In addition, across energy sources, the largest partisan gaps were for fossil fuels, with a 16.1 percentage point gap in the control condition, a 18.1 percentage point gap in the climate condition, and a 23.5 percentage point gap in the Trump condition. Looking at within-party differences, conservative Republicans in the Trump condition preferred 9.5 percentage points more fossil fuels than those in the control and 9.4 more than those in the climate condition. Significant differences existed between political beliefs for fossil fuels, as shown in the omnibus F-test in</w:t>
       </w:r>
       <w:r>
         <w:t xml:space="preserve"> </w:t>
@@ -6966,7 +7018,7 @@
         </w:r>
       </w:hyperlink>
       <w:r>
-        <w:t xml:space="preserve">. The difference between liberal Democrats and conservative Republicans was -7.3 percentage points percentage points from the Trump to control condition, and -5.4 percentage points percentage points between the Trump and climate change conditions. Finally, all respondents across all conditions preferred an energy mix with fewer fossil fuels than the US currently uses, with conservative Republicans in the Trump condition preferring a smaller reduction.</w:t>
+        <w:t xml:space="preserve">. The difference between liberal Democrats and conservative Republicans was -7.3 percentage points from the Trump to control condition, and -5.4 percentage points between the Trump and climate change conditions. Finally, all respondents across all conditions preferred an energy mix with fewer fossil fuels than the US currently uses, with conservative Republicans in the Trump condition preferring a smaller reduction.</w:t>
       </w:r>
     </w:p>
     <w:p>
@@ -6989,7 +7041,7 @@
         <w:t xml:space="preserve">Renewables</w:t>
       </w:r>
       <w:r>
-        <w:t xml:space="preserve">: I hypothesized that Conservative Republicans who received the Trump cue would prefer an energy mix with fewer renewables, and that is the case. Compared to the control, Republicans given the Trump cue preferred 2.4 percentage points (p = 0.046) percentage points, 3.4 percentage points (p = 0.017) less solar, and 1.6 percentage points (p = 0.100) less hydro. For the Trump cue versus the climate cue, Republicans preferred less wind at 3.1 percentage points (p = 0.011). However, there was no evidence of a backlash, as no significant differences existed between the climate and control for Republicans. While renewables were polarized and the Trump cue served to shift Republicans away from renewables, Republicans, on average, still preferred an energy mix with more renewable sources than the current baseline across all conditions.</w:t>
+        <w:t xml:space="preserve">: I hypothesized that Conservative Republicans who received the Trump cue would prefer an energy mix with fewer renewables, and that is the case. Compared to the control, Republicans given the Trump cue preferred 2.4 percentage points (p = 0.046) percentage points, 3.4 percentage points (p = 0.017) less solar, and 1.6 percentage points (p = 0.100) less hydro. For the Trump cue versus the climate cue, Republicans preferred less wind at 3.1 percentage points (p = 0.011). However, there was no evidence of a backlash, as no significant differences existed between the climate and control conditions for Republicans. While renewables were polarized and the Trump cue served to shift Republicans away from renewables, Republicans, on average, still preferred an energy mix with more renewable sources than the current baseline across all conditions.</w:t>
       </w:r>
     </w:p>
     <w:p>
@@ -6997,7 +7049,7 @@
         <w:pStyle w:val="BodyText"/>
       </w:pPr>
       <w:r>
-        <w:t xml:space="preserve">For liberal Democrats, I expected that they would prefer more renewables in the climate and Trump conditions. This was only the case for hydro in the climate versus control condition, with a difference of 1.6 percentage points (p = 0.018). Additionally, contrary to expectations, there was no backlash effect as Democrats preferred slightly less solar energy in the Trump condition versus the control and slightly less wind energy in the Trump condition versus the climate condition. Similar to the fossil fuel results, these differences are small as the preferred energy mix of liberal Democrats is dominated by renewables, with solar at 29%, 29%, and 27% in the control, climate, and Trump conditions, respectively. This was followed by wind at 27%, 27%, and 26% under the three conditions.</w:t>
+        <w:t xml:space="preserve">For liberal Democrats, I expected that they would prefer more renewables in the climate and Trump conditions. This was only the case for hydro in the climate versus control condition, with a difference of 1.6 percentage points (p = 0.018). Additionally, contrary to expectations, there was no backlash effect as Democrats preferred slightly less solar energy in the Trump condition versus the control and slightly less wind energy in the Trump condition versus the climate condition. Similar to the fossil fuel results, these differences are small as the preferred energy mix of liberal Democrats is dominated by renewables, with solar at 29%, 29%, and 27% in the control, climate, and Trump conditions, respectively. This was followed by wind at 27%, 27%, and 26% under the three respective conditions.</w:t>
       </w:r>
     </w:p>
     <w:p>
@@ -7045,7 +7097,7 @@
         <w:t xml:space="preserve"> </w:t>
       </w:r>
       <w:r>
-        <w:t xml:space="preserve">fossil fuels after receiving the Trump cue than the climate cue or the control. However, these results reflect the fact that the preferred percentage for Democrats in the climate change condition was low at 13%, compared to Trump’s condition at 17% and 15% in the control.</w:t>
+        <w:t xml:space="preserve">fossil fuels after receiving the Trump cue than the climate cue or the control. However, these results reflect the impact of the climate cue as the preferred percentage for Democrats in the climate change condition was low at 13%, compared to Trump’s condition at 17% and 15% in the control.</w:t>
       </w:r>
     </w:p>
     <w:p>
@@ -7061,52 +7113,52 @@
         <w:pStyle w:val="BodyText"/>
       </w:pPr>
       <w:r>
-        <w:t xml:space="preserve">While this paper provides some insights into the polarization of energy issues, it has some limitations. One possible limitation is the timing of the survey. It was fielded in April 2026 when US military actions in Iran created high levels of uncertainty regarding energy supply and prices. Additionally, the data are cross-sectional, which limits the ability to understand opinion dynamics at a time when there is a lot happening regarding energy. Future research should use panel data to explore responses to Trump’s actions in the context of other events. Finally, survey experiments such as the one here are generally strong in terms of internal validity; however, they are weaker on external validity as multiple factors shape how the public views issues such as energy. Utilizing panel data could also help address concerns regarding external validity.</w:t>
+        <w:t xml:space="preserve">While this paper provides some insights into the polarization of energy issues, it has some limitations. One possible limitation is the timing of the survey. It was fielded in April 2026 when US military actions in Iran created high levels of uncertainty regarding energy supply and prices. Additionally, the data are cross-sectional, which limits the ability to understand opinion dynamics at a time when there is a lot happening regarding energy. Future research should use panel data to explore responses to Trump’s actions in the context of other events. Finally, survey experiments such as the one used here are generally strong in terms of internal validity; however, they are weaker on external validity as multiple factors shape how the public views issues such as energy. Utilizing panel data could also help address concerns regarding external validity.</w:t>
+      </w:r>
+    </w:p>
+    <w:bookmarkEnd w:id="36"/>
+    <w:bookmarkStart w:id="37" w:name="conclusion"/>
+    <w:p>
+      <w:pPr>
+        <w:pStyle w:val="Heading1"/>
+      </w:pPr>
+      <w:r>
+        <w:t xml:space="preserve">Conclusion</w:t>
+      </w:r>
+    </w:p>
+    <w:p>
+      <w:pPr>
+        <w:pStyle w:val="FirstParagraph"/>
+      </w:pPr>
+      <w:r>
+        <w:t xml:space="preserve">Addressing and limiting the impacts of climate change requires transitioning away from fossil fuels as the primary energy source. In general, the US public supports the energy transition, even as climate change remains polarized. However, support for fossil fuels and opposition to renewables have increased among Republicans over the last decade.</w:t>
+      </w:r>
+    </w:p>
+    <w:p>
+      <w:pPr>
+        <w:pStyle w:val="BodyText"/>
+      </w:pPr>
+      <w:r>
+        <w:t xml:space="preserve">Using a survey experiment, I found that the Trump effect was the most likely cause of the shift in energy preferences among Republicans. Trump has long indicated his support for fossil fuels and opposition to renewables. Since taking office in 2025, he has aggressively sought to limit the development of renewable sources of energy. These actions and rhetoric likely served to further polarize support for various energy sources, particularly fossil fuels as support grew among conservative Republicans. Despite this increased polarization, the US public still seems to prefer an energy mix with more renewables and fewer fossil fuels.</w:t>
+      </w:r>
+    </w:p>
+    <w:p>
+      <w:r>
+        <w:br w:type="page"/>
       </w:r>
     </w:p>
     <w:bookmarkEnd w:id="37"/>
-    <w:bookmarkStart w:id="38" w:name="conclusion"/>
+    <w:bookmarkStart w:id="85" w:name="references"/>
     <w:p>
       <w:pPr>
         <w:pStyle w:val="Heading1"/>
       </w:pPr>
       <w:r>
-        <w:t xml:space="preserve">Conclusion</w:t>
-      </w:r>
-    </w:p>
-    <w:p>
-      <w:pPr>
-        <w:pStyle w:val="FirstParagraph"/>
-      </w:pPr>
-      <w:r>
-        <w:t xml:space="preserve">Addressing and limiting the impacts of climate change requires transitioning away from fossil fuels as the primary energy source. In general, the US public supports the energy transition, even as climate change remains polarized. However, support for fossil fuels and opposition to renewables have increased among Republicans over the last decade.</w:t>
-      </w:r>
-    </w:p>
-    <w:p>
-      <w:pPr>
-        <w:pStyle w:val="BodyText"/>
-      </w:pPr>
-      <w:r>
-        <w:t xml:space="preserve">Using a survey experiment, I found that the Trump effect was the most likely cause of the shift in energy preferences among Republicans. Trump has long indicated his support for fossil fuels and opposition to renewables. Since taking office for the second time, he has aggressively sought to limit the development of renewable sources of energy. These actions likely served to further polarize support for various energy sources, particularly among conservative Republicans and fossil fuels. Despite this increased polarization, the US public still seems to prefer an energy mix with more renewables and fewer fossil fuels.</w:t>
-      </w:r>
-    </w:p>
-    <w:p>
-      <w:r>
-        <w:br w:type="page"/>
-      </w:r>
-    </w:p>
-    <w:bookmarkEnd w:id="38"/>
-    <w:bookmarkStart w:id="86" w:name="references"/>
-    <w:p>
-      <w:pPr>
-        <w:pStyle w:val="Heading1"/>
-      </w:pPr>
-      <w:r>
         <w:t xml:space="preserve">References</w:t>
       </w:r>
     </w:p>
-    <w:bookmarkStart w:id="85" w:name="refs"/>
-    <w:bookmarkStart w:id="39" w:name="ref-aklinDebatingCleanEnergy2013"/>
+    <w:bookmarkStart w:id="84" w:name="refs"/>
+    <w:bookmarkStart w:id="38" w:name="ref-aklinDebatingCleanEnergy2013"/>
     <w:p>
       <w:pPr>
         <w:pStyle w:val="Bibliography"/>
@@ -7173,8 +7225,8 @@
         <w:t xml:space="preserve">23(5): 1225–32.</w:t>
       </w:r>
     </w:p>
-    <w:bookmarkEnd w:id="39"/>
-    <w:bookmarkStart w:id="40" w:name="ref-ansolabehereCheapCleanHow2016"/>
+    <w:bookmarkEnd w:id="38"/>
+    <w:bookmarkStart w:id="39" w:name="ref-ansolabehereCheapCleanHow2016"/>
     <w:p>
       <w:pPr>
         <w:pStyle w:val="Bibliography"/>
@@ -7315,8 +7367,8 @@
         <w:t xml:space="preserve">. The MIT Press.</w:t>
       </w:r>
     </w:p>
-    <w:bookmarkEnd w:id="40"/>
-    <w:bookmarkStart w:id="41" w:name="Xf7b1d384975e08b7a6f69496a22b7641af9fcea"/>
+    <w:bookmarkEnd w:id="39"/>
+    <w:bookmarkStart w:id="40" w:name="Xf7b1d384975e08b7a6f69496a22b7641af9fcea"/>
     <w:p>
       <w:pPr>
         <w:pStyle w:val="Bibliography"/>
@@ -7371,8 +7423,8 @@
         <w:t xml:space="preserve">64(2): 498–557.</w:t>
       </w:r>
     </w:p>
-    <w:bookmarkEnd w:id="41"/>
-    <w:bookmarkStart w:id="42" w:name="ref-bergquistEnergyPolicyPublic2020"/>
+    <w:bookmarkEnd w:id="40"/>
+    <w:bookmarkStart w:id="41" w:name="ref-bergquistEnergyPolicyPublic2020"/>
     <w:p>
       <w:pPr>
         <w:pStyle w:val="Bibliography"/>
@@ -7454,8 +7506,8 @@
         <w:t xml:space="preserve">2(3): 032003.</w:t>
       </w:r>
     </w:p>
-    <w:bookmarkEnd w:id="42"/>
-    <w:bookmarkStart w:id="43" w:name="ref-brulleShiftingPublicOpinion2012"/>
+    <w:bookmarkEnd w:id="41"/>
+    <w:bookmarkStart w:id="42" w:name="ref-brulleShiftingPublicOpinion2012"/>
     <w:p>
       <w:pPr>
         <w:pStyle w:val="Bibliography"/>
@@ -7558,8 +7610,8 @@
         <w:t xml:space="preserve">114(2): 169–88.</w:t>
       </w:r>
     </w:p>
-    <w:bookmarkEnd w:id="43"/>
-    <w:bookmarkStart w:id="44" w:name="Xe2f60b19880ed838481f3c35ad0ea337658d4d1"/>
+    <w:bookmarkEnd w:id="42"/>
+    <w:bookmarkStart w:id="43" w:name="Xe2f60b19880ed838481f3c35ad0ea337658d4d1"/>
     <w:p>
       <w:pPr>
         <w:pStyle w:val="Bibliography"/>
@@ -7644,8 +7696,8 @@
         <w:t xml:space="preserve">(0): 1–32.</w:t>
       </w:r>
     </w:p>
-    <w:bookmarkEnd w:id="44"/>
-    <w:bookmarkStart w:id="45" w:name="Xebf368cafe554979714668cfecf3730e40614f9"/>
+    <w:bookmarkEnd w:id="43"/>
+    <w:bookmarkStart w:id="44" w:name="Xebf368cafe554979714668cfecf3730e40614f9"/>
     <w:p>
       <w:pPr>
         <w:pStyle w:val="Bibliography"/>
@@ -7742,8 +7794,8 @@
         <w:t xml:space="preserve">51: 156–67.</w:t>
       </w:r>
     </w:p>
-    <w:bookmarkEnd w:id="45"/>
-    <w:bookmarkStart w:id="46" w:name="ref-croweEffectPartisanCues2020"/>
+    <w:bookmarkEnd w:id="44"/>
+    <w:bookmarkStart w:id="45" w:name="ref-croweEffectPartisanCues2020"/>
     <w:p>
       <w:pPr>
         <w:pStyle w:val="Bibliography"/>
@@ -7843,8 +7895,8 @@
         <w:t xml:space="preserve">101(4): 1461–74.</w:t>
       </w:r>
     </w:p>
-    <w:bookmarkEnd w:id="46"/>
-    <w:bookmarkStart w:id="47" w:name="X27179e39f52caa689f22cc3347e1f866f47b9b7"/>
+    <w:bookmarkEnd w:id="45"/>
+    <w:bookmarkStart w:id="46" w:name="X27179e39f52caa689f22cc3347e1f866f47b9b7"/>
     <w:p>
       <w:pPr>
         <w:pStyle w:val="Bibliography"/>
@@ -7929,8 +7981,8 @@
         <w:t xml:space="preserve">31(1): 1–16.</w:t>
       </w:r>
     </w:p>
-    <w:bookmarkEnd w:id="47"/>
-    <w:bookmarkStart w:id="48" w:name="X1c152469eab8dc86eeea4ab94fdfc8ef1ce9dfe"/>
+    <w:bookmarkEnd w:id="46"/>
+    <w:bookmarkStart w:id="47" w:name="X1c152469eab8dc86eeea4ab94fdfc8ef1ce9dfe"/>
     <w:p>
       <w:pPr>
         <w:pStyle w:val="Bibliography"/>
@@ -7994,8 +8046,8 @@
         <w:t xml:space="preserve">9(2): 111–19.</w:t>
       </w:r>
     </w:p>
-    <w:bookmarkEnd w:id="48"/>
-    <w:bookmarkStart w:id="49" w:name="ref-dunlapWideningGapRepublican2008"/>
+    <w:bookmarkEnd w:id="47"/>
+    <w:bookmarkStart w:id="48" w:name="ref-dunlapWideningGapRepublican2008"/>
     <w:p>
       <w:pPr>
         <w:pStyle w:val="Bibliography"/>
@@ -8068,8 +8120,8 @@
         <w:t xml:space="preserve">50(5): 26–35.</w:t>
       </w:r>
     </w:p>
-    <w:bookmarkEnd w:id="49"/>
-    <w:bookmarkStart w:id="50" w:name="ref-dunlapPoliticalDivideClimate2016"/>
+    <w:bookmarkEnd w:id="48"/>
+    <w:bookmarkStart w:id="49" w:name="ref-dunlapPoliticalDivideClimate2016"/>
     <w:p>
       <w:pPr>
         <w:pStyle w:val="Bibliography"/>
@@ -8148,8 +8200,8 @@
         <w:t xml:space="preserve">58(5): 4–23.</w:t>
       </w:r>
     </w:p>
-    <w:bookmarkEnd w:id="50"/>
-    <w:bookmarkStart w:id="51" w:name="ref-eganUSPartisanPolarization2024"/>
+    <w:bookmarkEnd w:id="49"/>
+    <w:bookmarkStart w:id="50" w:name="ref-eganUSPartisanPolarization2024"/>
     <w:p>
       <w:pPr>
         <w:pStyle w:val="Bibliography"/>
@@ -8219,8 +8271,8 @@
         <w:t xml:space="preserve">57(1): 30–35.</w:t>
       </w:r>
     </w:p>
-    <w:bookmarkEnd w:id="51"/>
-    <w:bookmarkStart w:id="52" w:name="ref-essigTrumpEffectPolitical2021"/>
+    <w:bookmarkEnd w:id="50"/>
+    <w:bookmarkStart w:id="51" w:name="ref-essigTrumpEffectPolitical2021"/>
     <w:p>
       <w:pPr>
         <w:pStyle w:val="Bibliography"/>
@@ -8317,8 +8369,8 @@
         <w:t xml:space="preserve">49(3): 328–42.</w:t>
       </w:r>
     </w:p>
-    <w:bookmarkEnd w:id="52"/>
-    <w:bookmarkStart w:id="53" w:name="ref-feldmanClimateChangePolarizing2018"/>
+    <w:bookmarkEnd w:id="51"/>
+    <w:bookmarkStart w:id="52" w:name="ref-feldmanClimateChangePolarizing2018"/>
     <w:p>
       <w:pPr>
         <w:pStyle w:val="Bibliography"/>
@@ -8403,8 +8455,8 @@
         <w:t xml:space="preserve">51: 54–66.</w:t>
       </w:r>
     </w:p>
-    <w:bookmarkEnd w:id="53"/>
-    <w:bookmarkStart w:id="54" w:name="X84270ebadc61ed83cf52cd61afa61cee7262e56"/>
+    <w:bookmarkEnd w:id="52"/>
+    <w:bookmarkStart w:id="53" w:name="X84270ebadc61ed83cf52cd61afa61cee7262e56"/>
     <w:p>
       <w:pPr>
         <w:pStyle w:val="Bibliography"/>
@@ -8456,8 +8508,8 @@
         <w:t xml:space="preserve">35(4): 846–68.</w:t>
       </w:r>
     </w:p>
-    <w:bookmarkEnd w:id="54"/>
-    <w:bookmarkStart w:id="55" w:name="ref-gerrardTrumpsMultiProngedAttack2025"/>
+    <w:bookmarkEnd w:id="53"/>
+    <w:bookmarkStart w:id="54" w:name="ref-gerrardTrumpsMultiProngedAttack2025"/>
     <w:p>
       <w:pPr>
         <w:pStyle w:val="Bibliography"/>
@@ -8506,8 +8558,8 @@
         <w:t xml:space="preserve">.</w:t>
       </w:r>
     </w:p>
-    <w:bookmarkEnd w:id="55"/>
-    <w:bookmarkStart w:id="56" w:name="ref-guptaTrackingNuclearMood2019"/>
+    <w:bookmarkEnd w:id="54"/>
+    <w:bookmarkStart w:id="55" w:name="ref-guptaTrackingNuclearMood2019"/>
     <w:p>
       <w:pPr>
         <w:pStyle w:val="Bibliography"/>
@@ -8598,8 +8650,8 @@
         <w:t xml:space="preserve">133.</w:t>
       </w:r>
     </w:p>
-    <w:bookmarkEnd w:id="56"/>
-    <w:bookmarkStart w:id="57" w:name="Xfffb65b6370bfa57249c199162bb375462c420a"/>
+    <w:bookmarkEnd w:id="55"/>
+    <w:bookmarkStart w:id="56" w:name="Xfffb65b6370bfa57249c199162bb375462c420a"/>
     <w:p>
       <w:pPr>
         <w:pStyle w:val="Bibliography"/>
@@ -8684,8 +8736,8 @@
         <w:t xml:space="preserve">7(11): 1023–30.</w:t>
       </w:r>
     </w:p>
-    <w:bookmarkEnd w:id="57"/>
-    <w:bookmarkStart w:id="58" w:name="X3dc7f787e182e4dd48e8853dfbac57823334453"/>
+    <w:bookmarkEnd w:id="56"/>
+    <w:bookmarkStart w:id="57" w:name="X3dc7f787e182e4dd48e8853dfbac57823334453"/>
     <w:p>
       <w:pPr>
         <w:pStyle w:val="Bibliography"/>
@@ -8737,8 +8789,8 @@
         <w:t xml:space="preserve">141: 111448.</w:t>
       </w:r>
     </w:p>
-    <w:bookmarkEnd w:id="58"/>
-    <w:bookmarkStart w:id="59" w:name="X27185224445e8894ff24d837fc80cc72b2208d7"/>
+    <w:bookmarkEnd w:id="57"/>
+    <w:bookmarkStart w:id="58" w:name="X27185224445e8894ff24d837fc80cc72b2208d7"/>
     <w:p>
       <w:pPr>
         <w:pStyle w:val="Bibliography"/>
@@ -8802,8 +8854,8 @@
         <w:t xml:space="preserve">9: 940–44.</w:t>
       </w:r>
     </w:p>
-    <w:bookmarkEnd w:id="59"/>
-    <w:bookmarkStart w:id="60" w:name="ref-hamiltonChangeWindUS2018"/>
+    <w:bookmarkEnd w:id="58"/>
+    <w:bookmarkStart w:id="59" w:name="ref-hamiltonChangeWindUS2018"/>
     <w:p>
       <w:pPr>
         <w:pStyle w:val="Bibliography"/>
@@ -8888,8 +8940,8 @@
         <w:t xml:space="preserve">8(1): 11.</w:t>
       </w:r>
     </w:p>
-    <w:bookmarkEnd w:id="60"/>
-    <w:bookmarkStart w:id="61" w:name="ref-hartPoliticalPolarizationSupport2021"/>
+    <w:bookmarkEnd w:id="59"/>
+    <w:bookmarkStart w:id="60" w:name="ref-hartPoliticalPolarizationSupport2021"/>
     <w:p>
       <w:pPr>
         <w:pStyle w:val="Bibliography"/>
@@ -8953,8 +9005,8 @@
         <w:t xml:space="preserve">150: 112156.</w:t>
       </w:r>
     </w:p>
-    <w:bookmarkEnd w:id="61"/>
-    <w:bookmarkStart w:id="62" w:name="ref-hawesClimateSciencePolitics2022"/>
+    <w:bookmarkEnd w:id="60"/>
+    <w:bookmarkStart w:id="61" w:name="ref-hawesClimateSciencePolitics2022"/>
     <w:p>
       <w:pPr>
         <w:pStyle w:val="Bibliography"/>
@@ -9075,8 +9127,8 @@
         <w:t xml:space="preserve">85: 102419.</w:t>
       </w:r>
     </w:p>
-    <w:bookmarkEnd w:id="62"/>
-    <w:bookmarkStart w:id="63" w:name="ref-howellSeeingRiskColoredGlasses2019"/>
+    <w:bookmarkEnd w:id="61"/>
+    <w:bookmarkStart w:id="62" w:name="ref-howellSeeingRiskColoredGlasses2019"/>
     <w:p>
       <w:pPr>
         <w:pStyle w:val="Bibliography"/>
@@ -9179,8 +9231,8 @@
         <w:t xml:space="preserve">55: 168–78.</w:t>
       </w:r>
     </w:p>
-    <w:bookmarkEnd w:id="63"/>
-    <w:bookmarkStart w:id="64" w:name="ref-jeongPolarisationEnergyPolicy2021"/>
+    <w:bookmarkEnd w:id="62"/>
+    <w:bookmarkStart w:id="63" w:name="ref-jeongPolarisationEnergyPolicy2021"/>
     <w:p>
       <w:pPr>
         <w:pStyle w:val="Bibliography"/>
@@ -9244,8 +9296,8 @@
         <w:t xml:space="preserve">41(1): 17–41.</w:t>
       </w:r>
     </w:p>
-    <w:bookmarkEnd w:id="64"/>
-    <w:bookmarkStart w:id="65" w:name="ref-joselowHowTrumpsFirst2025"/>
+    <w:bookmarkEnd w:id="63"/>
+    <w:bookmarkStart w:id="64" w:name="ref-joselowHowTrumpsFirst2025"/>
     <w:p>
       <w:pPr>
         <w:pStyle w:val="Bibliography"/>
@@ -9318,63 +9370,63 @@
         <w:t xml:space="preserve">.</w:t>
       </w:r>
     </w:p>
+    <w:bookmarkEnd w:id="64"/>
+    <w:bookmarkStart w:id="65" w:name="ref-kennedyAmericansShiftingViews2026"/>
+    <w:p>
+      <w:pPr>
+        <w:pStyle w:val="Bibliography"/>
+      </w:pPr>
+      <w:r>
+        <w:t xml:space="preserve">Kennedy, Brian, and Emma Kikuchi. 2026.</w:t>
+      </w:r>
+      <w:r>
+        <w:t xml:space="preserve"> </w:t>
+      </w:r>
+      <w:r>
+        <w:t xml:space="preserve">“Americans’</w:t>
+      </w:r>
+      <w:r>
+        <w:t xml:space="preserve"> </w:t>
+      </w:r>
+      <w:r>
+        <w:t xml:space="preserve">Shifting Views</w:t>
+      </w:r>
+      <w:r>
+        <w:t xml:space="preserve"> </w:t>
+      </w:r>
+      <w:r>
+        <w:t xml:space="preserve">on</w:t>
+      </w:r>
+      <w:r>
+        <w:t xml:space="preserve"> </w:t>
+      </w:r>
+      <w:r>
+        <w:t xml:space="preserve">Energy Sources</w:t>
+      </w:r>
+      <w:r>
+        <w:t xml:space="preserve">,</w:t>
+      </w:r>
+      <w:r>
+        <w:t xml:space="preserve"> </w:t>
+      </w:r>
+      <w:r>
+        <w:t xml:space="preserve">Policy</w:t>
+      </w:r>
+      <w:r>
+        <w:t xml:space="preserve"> </w:t>
+      </w:r>
+      <w:r>
+        <w:t xml:space="preserve">in 2026.”</w:t>
+      </w:r>
+      <w:r>
+        <w:t xml:space="preserve"> </w:t>
+      </w:r>
+      <w:r>
+        <w:t xml:space="preserve">https://www.pewresearch.org/science/2026/04/03/americans-shifting-views-on-energy-issues/ (April 21, 2026).</w:t>
+      </w:r>
+    </w:p>
     <w:bookmarkEnd w:id="65"/>
-    <w:bookmarkStart w:id="66" w:name="ref-kennedyAmericansShiftingViews2026"/>
-    <w:p>
-      <w:pPr>
-        <w:pStyle w:val="Bibliography"/>
-      </w:pPr>
-      <w:r>
-        <w:t xml:space="preserve">Kennedy, Brian, and Emma Kikuchi. 2026.</w:t>
-      </w:r>
-      <w:r>
-        <w:t xml:space="preserve"> </w:t>
-      </w:r>
-      <w:r>
-        <w:t xml:space="preserve">“Americans’</w:t>
-      </w:r>
-      <w:r>
-        <w:t xml:space="preserve"> </w:t>
-      </w:r>
-      <w:r>
-        <w:t xml:space="preserve">Shifting Views</w:t>
-      </w:r>
-      <w:r>
-        <w:t xml:space="preserve"> </w:t>
-      </w:r>
-      <w:r>
-        <w:t xml:space="preserve">on</w:t>
-      </w:r>
-      <w:r>
-        <w:t xml:space="preserve"> </w:t>
-      </w:r>
-      <w:r>
-        <w:t xml:space="preserve">Energy Sources</w:t>
-      </w:r>
-      <w:r>
-        <w:t xml:space="preserve">,</w:t>
-      </w:r>
-      <w:r>
-        <w:t xml:space="preserve"> </w:t>
-      </w:r>
-      <w:r>
-        <w:t xml:space="preserve">Policy</w:t>
-      </w:r>
-      <w:r>
-        <w:t xml:space="preserve"> </w:t>
-      </w:r>
-      <w:r>
-        <w:t xml:space="preserve">in 2026.”</w:t>
-      </w:r>
-      <w:r>
-        <w:t xml:space="preserve"> </w:t>
-      </w:r>
-      <w:r>
-        <w:t xml:space="preserve">https://www.pewresearch.org/science/2026/04/03/americans-shifting-views-on-energy-issues/ (April 21, 2026).</w:t>
-      </w:r>
-    </w:p>
-    <w:bookmarkEnd w:id="66"/>
-    <w:bookmarkStart w:id="67" w:name="ref-krosnickImpactFall19972000"/>
+    <w:bookmarkStart w:id="66" w:name="ref-krosnickImpactFall19972000"/>
     <w:p>
       <w:pPr>
         <w:pStyle w:val="Bibliography"/>
@@ -9450,8 +9502,8 @@
         <w:t xml:space="preserve">9(3): 239–60.</w:t>
       </w:r>
     </w:p>
-    <w:bookmarkEnd w:id="67"/>
-    <w:bookmarkStart w:id="68" w:name="ref-lowryDisentanglingEnergyPolicy2008"/>
+    <w:bookmarkEnd w:id="66"/>
+    <w:bookmarkStart w:id="67" w:name="ref-lowryDisentanglingEnergyPolicy2008"/>
     <w:p>
       <w:pPr>
         <w:pStyle w:val="Bibliography"/>
@@ -9503,8 +9555,8 @@
         <w:t xml:space="preserve">89(5): 1195–1211.</w:t>
       </w:r>
     </w:p>
-    <w:bookmarkEnd w:id="68"/>
-    <w:bookmarkStart w:id="69" w:name="X012e76b31d5d5dc04bc07e28072074c013120fb"/>
+    <w:bookmarkEnd w:id="67"/>
+    <w:bookmarkStart w:id="68" w:name="X012e76b31d5d5dc04bc07e28072074c013120fb"/>
     <w:p>
       <w:pPr>
         <w:pStyle w:val="Bibliography"/>
@@ -9565,8 +9617,8 @@
         <w:t xml:space="preserve">18(2): 024002.</w:t>
       </w:r>
     </w:p>
-    <w:bookmarkEnd w:id="69"/>
-    <w:bookmarkStart w:id="70" w:name="ref-mcbethPoliticalIdeologyNuclear2023a"/>
+    <w:bookmarkEnd w:id="68"/>
+    <w:bookmarkStart w:id="69" w:name="ref-mcbethPoliticalIdeologyNuclear2023a"/>
     <w:p>
       <w:pPr>
         <w:pStyle w:val="Bibliography"/>
@@ -9645,8 +9697,8 @@
         <w:t xml:space="preserve">40(1): 88–118.</w:t>
       </w:r>
     </w:p>
-    <w:bookmarkEnd w:id="70"/>
-    <w:bookmarkStart w:id="71" w:name="Xfaeef3ee7dea4a33ed34a32a7472cd4613d38dd"/>
+    <w:bookmarkEnd w:id="69"/>
+    <w:bookmarkStart w:id="70" w:name="Xfaeef3ee7dea4a33ed34a32a7472cd4613d38dd"/>
     <w:p>
       <w:pPr>
         <w:pStyle w:val="Bibliography"/>
@@ -9743,75 +9795,75 @@
         <w:t xml:space="preserve">52(2): 155–94.</w:t>
       </w:r>
     </w:p>
+    <w:bookmarkEnd w:id="70"/>
+    <w:bookmarkStart w:id="71" w:name="X61f9dc53d23f395f6b55ebe787087b280b52f47"/>
+    <w:p>
+      <w:pPr>
+        <w:pStyle w:val="Bibliography"/>
+      </w:pPr>
+      <w:r>
+        <w:t xml:space="preserve">McDermott, Jennifer, and Matthew Daly. 2026.</w:t>
+      </w:r>
+      <w:r>
+        <w:t xml:space="preserve"> </w:t>
+      </w:r>
+      <w:r>
+        <w:t xml:space="preserve">“Trump</w:t>
+      </w:r>
+      <w:r>
+        <w:t xml:space="preserve"> </w:t>
+      </w:r>
+      <w:r>
+        <w:t xml:space="preserve">Administration Announces</w:t>
+      </w:r>
+      <w:r>
+        <w:t xml:space="preserve"> </w:t>
+      </w:r>
+      <w:r>
+        <w:t xml:space="preserve">$17.5</w:t>
+      </w:r>
+      <w:r>
+        <w:t xml:space="preserve"> </w:t>
+      </w:r>
+      <w:r>
+        <w:t xml:space="preserve">Billion</w:t>
+      </w:r>
+      <w:r>
+        <w:t xml:space="preserve"> </w:t>
+      </w:r>
+      <w:r>
+        <w:t xml:space="preserve">in</w:t>
+      </w:r>
+      <w:r>
+        <w:t xml:space="preserve"> </w:t>
+      </w:r>
+      <w:r>
+        <w:t xml:space="preserve">Loans</w:t>
+      </w:r>
+      <w:r>
+        <w:t xml:space="preserve"> </w:t>
+      </w:r>
+      <w:r>
+        <w:t xml:space="preserve">for 10</w:t>
+      </w:r>
+      <w:r>
+        <w:t xml:space="preserve"> </w:t>
+      </w:r>
+      <w:r>
+        <w:t xml:space="preserve">New Large Nuclear Reactors</w:t>
+      </w:r>
+      <w:r>
+        <w:t xml:space="preserve">.”</w:t>
+      </w:r>
+      <w:r>
+        <w:t xml:space="preserve"> </w:t>
+      </w:r>
+      <w:r>
+        <w:t xml:space="preserve">https://abcnews.com/Business/wireStory/trump-administration-announces-175-billion-loans-10-new-134137821 (June 25, 2026).</w:t>
+      </w:r>
+    </w:p>
     <w:bookmarkEnd w:id="71"/>
-    <w:bookmarkStart w:id="72" w:name="X61f9dc53d23f395f6b55ebe787087b280b52f47"/>
-    <w:p>
-      <w:pPr>
-        <w:pStyle w:val="Bibliography"/>
-      </w:pPr>
-      <w:r>
-        <w:t xml:space="preserve">McDermott, Jennifer, and Matthew Daly. 2026.</w:t>
-      </w:r>
-      <w:r>
-        <w:t xml:space="preserve"> </w:t>
-      </w:r>
-      <w:r>
-        <w:t xml:space="preserve">“Trump</w:t>
-      </w:r>
-      <w:r>
-        <w:t xml:space="preserve"> </w:t>
-      </w:r>
-      <w:r>
-        <w:t xml:space="preserve">Administration Announces</w:t>
-      </w:r>
-      <w:r>
-        <w:t xml:space="preserve"> </w:t>
-      </w:r>
-      <w:r>
-        <w:t xml:space="preserve">$17.5</w:t>
-      </w:r>
-      <w:r>
-        <w:t xml:space="preserve"> </w:t>
-      </w:r>
-      <w:r>
-        <w:t xml:space="preserve">Billion</w:t>
-      </w:r>
-      <w:r>
-        <w:t xml:space="preserve"> </w:t>
-      </w:r>
-      <w:r>
-        <w:t xml:space="preserve">in</w:t>
-      </w:r>
-      <w:r>
-        <w:t xml:space="preserve"> </w:t>
-      </w:r>
-      <w:r>
-        <w:t xml:space="preserve">Loans</w:t>
-      </w:r>
-      <w:r>
-        <w:t xml:space="preserve"> </w:t>
-      </w:r>
-      <w:r>
-        <w:t xml:space="preserve">for 10</w:t>
-      </w:r>
-      <w:r>
-        <w:t xml:space="preserve"> </w:t>
-      </w:r>
-      <w:r>
-        <w:t xml:space="preserve">New Large Nuclear Reactors</w:t>
-      </w:r>
-      <w:r>
-        <w:t xml:space="preserve">.”</w:t>
-      </w:r>
-      <w:r>
-        <w:t xml:space="preserve"> </w:t>
-      </w:r>
-      <w:r>
-        <w:t xml:space="preserve">https://abcnews.com/Business/wireStory/trump-administration-announces-175-billion-loans-10-new-134137821 (June 25, 2026).</w:t>
-      </w:r>
-    </w:p>
-    <w:bookmarkEnd w:id="72"/>
-    <w:bookmarkStart w:id="73" w:name="ref-merkleyPartyCuesNews2021"/>
+    <w:bookmarkStart w:id="72" w:name="ref-merkleyPartyCuesNews2021"/>
     <w:p>
       <w:pPr>
         <w:pStyle w:val="Bibliography"/>
@@ -9902,8 +9954,8 @@
         <w:t xml:space="preserve">51(4): 1439–56.</w:t>
       </w:r>
     </w:p>
-    <w:bookmarkEnd w:id="73"/>
-    <w:bookmarkStart w:id="74" w:name="ref-nicholsonPolarizingCues2012"/>
+    <w:bookmarkEnd w:id="72"/>
+    <w:bookmarkStart w:id="73" w:name="ref-nicholsonPolarizingCues2012"/>
     <w:p>
       <w:pPr>
         <w:pStyle w:val="Bibliography"/>
@@ -9943,8 +9995,8 @@
         <w:t xml:space="preserve">56(1): 52–66.</w:t>
       </w:r>
     </w:p>
-    <w:bookmarkEnd w:id="74"/>
-    <w:bookmarkStart w:id="75" w:name="X0aeaf6b854948b2cdf0296f02791eebffa60678"/>
+    <w:bookmarkEnd w:id="73"/>
+    <w:bookmarkStart w:id="74" w:name="X0aeaf6b854948b2cdf0296f02791eebffa60678"/>
     <w:p>
       <w:pPr>
         <w:pStyle w:val="Bibliography"/>
@@ -10008,8 +10060,8 @@
         <w:t xml:space="preserve">64: 101441.</w:t>
       </w:r>
     </w:p>
-    <w:bookmarkEnd w:id="75"/>
-    <w:bookmarkStart w:id="76" w:name="ref-seversonMoralFramesClimate2015"/>
+    <w:bookmarkEnd w:id="74"/>
+    <w:bookmarkStart w:id="75" w:name="ref-seversonMoralFramesClimate2015"/>
     <w:p>
       <w:pPr>
         <w:pStyle w:val="Bibliography"/>
@@ -10061,8 +10113,8 @@
         <w:t xml:space="preserve">96(5): 1277–90.</w:t>
       </w:r>
     </w:p>
-    <w:bookmarkEnd w:id="76"/>
-    <w:bookmarkStart w:id="77" w:name="Xa5c9f92c1fac0e0da55511beef719999fab450a"/>
+    <w:bookmarkEnd w:id="75"/>
+    <w:bookmarkStart w:id="76" w:name="Xa5c9f92c1fac0e0da55511beef719999fab450a"/>
     <w:p>
       <w:pPr>
         <w:pStyle w:val="Bibliography"/>
@@ -10126,8 +10178,8 @@
         <w:t xml:space="preserve">3(1): 2.</w:t>
       </w:r>
     </w:p>
-    <w:bookmarkEnd w:id="77"/>
-    <w:bookmarkStart w:id="78" w:name="ref-stokesRenewableEnergyPolicy2017"/>
+    <w:bookmarkEnd w:id="76"/>
+    <w:bookmarkStart w:id="77" w:name="ref-stokesRenewableEnergyPolicy2017"/>
     <w:p>
       <w:pPr>
         <w:pStyle w:val="Bibliography"/>
@@ -10191,8 +10243,8 @@
         <w:t xml:space="preserve">2(8, 8): 1–6.</w:t>
       </w:r>
     </w:p>
-    <w:bookmarkEnd w:id="78"/>
-    <w:bookmarkStart w:id="79" w:name="ref-taylorTrumpEffectImmigration2026"/>
+    <w:bookmarkEnd w:id="77"/>
+    <w:bookmarkStart w:id="78" w:name="ref-taylorTrumpEffectImmigration2026"/>
     <w:p>
       <w:pPr>
         <w:pStyle w:val="Bibliography"/>
@@ -10253,8 +10305,8 @@
         <w:t xml:space="preserve">46(1): 102–25.</w:t>
       </w:r>
     </w:p>
-    <w:bookmarkEnd w:id="79"/>
-    <w:bookmarkStart w:id="80" w:name="Xd384249e3706c84f9e93bae331eedd62bafe528"/>
+    <w:bookmarkEnd w:id="78"/>
+    <w:bookmarkStart w:id="79" w:name="Xd384249e3706c84f9e93bae331eedd62bafe528"/>
     <w:p>
       <w:pPr>
         <w:pStyle w:val="Bibliography"/>
@@ -10351,8 +10403,8 @@
         <w:t xml:space="preserve">Forthcoming: e70121.</w:t>
       </w:r>
     </w:p>
-    <w:bookmarkEnd w:id="80"/>
-    <w:bookmarkStart w:id="81" w:name="Xbcbd837b5b220bdd8209fd24f768be396961b6f"/>
+    <w:bookmarkEnd w:id="79"/>
+    <w:bookmarkStart w:id="80" w:name="Xbcbd837b5b220bdd8209fd24f768be396961b6f"/>
     <w:p>
       <w:pPr>
         <w:pStyle w:val="Bibliography"/>
@@ -10425,8 +10477,8 @@
         <w:t xml:space="preserve">91: 102759.</w:t>
       </w:r>
     </w:p>
-    <w:bookmarkEnd w:id="81"/>
-    <w:bookmarkStart w:id="82" w:name="ref-whitmarshToolsNewClimate2017"/>
+    <w:bookmarkEnd w:id="80"/>
+    <w:bookmarkStart w:id="81" w:name="ref-whitmarshToolsNewClimate2017"/>
     <w:p>
       <w:pPr>
         <w:pStyle w:val="Bibliography"/>
@@ -10511,8 +10563,8 @@
         <w:t xml:space="preserve">42: 122–35.</w:t>
       </w:r>
     </w:p>
-    <w:bookmarkEnd w:id="82"/>
-    <w:bookmarkStart w:id="83" w:name="ref-yeoPartisanAmplificationRisk2014"/>
+    <w:bookmarkEnd w:id="81"/>
+    <w:bookmarkStart w:id="82" w:name="ref-yeoPartisanAmplificationRisk2014"/>
     <w:p>
       <w:pPr>
         <w:pStyle w:val="Bibliography"/>
@@ -10609,8 +10661,8 @@
         <w:t xml:space="preserve">67: 727–36.</w:t>
       </w:r>
     </w:p>
-    <w:bookmarkEnd w:id="83"/>
-    <w:bookmarkStart w:id="84" w:name="ref-zhouBoomerangsJavelinsHow2016"/>
+    <w:bookmarkEnd w:id="82"/>
+    <w:bookmarkStart w:id="83" w:name="ref-zhouBoomerangsJavelinsHow2016"/>
     <w:p>
       <w:pPr>
         <w:pStyle w:val="Bibliography"/>
@@ -10671,9 +10723,9 @@
         <w:t xml:space="preserve">25(5): 788–811.</w:t>
       </w:r>
     </w:p>
+    <w:bookmarkEnd w:id="83"/>
     <w:bookmarkEnd w:id="84"/>
     <w:bookmarkEnd w:id="85"/>
-    <w:bookmarkEnd w:id="86"/>
     <w:sectPr>
       <w:footnotePr>
         <w:numRestart w:val="eachSect"/>
@@ -10718,11 +10770,11 @@
         <w:t xml:space="preserve"> </w:t>
       </w:r>
       <w:r>
-        <w:t xml:space="preserve">The hypotheses presented here are condensed version of those that were preregistered using the Open Science Framework (OSF): https://osf.io/s2ku8/overview?view_only=8d073e8b77f44768a27184b9b0aff785</w:t>
+        <w:t xml:space="preserve">The hypotheses presented here are condensed version of those that were preregistered using the Open Science Framework (OSF): https://osf.io/s2ku8/overview?view_only=8d073e8b77f44768a27184b9b0aff785. Additional hypotheses were preregistered and those are discussed in the supplemental material.</w:t>
       </w:r>
     </w:p>
   </w:footnote>
-  <w:footnote w:id="13">
+  <w:footnote w:id="14">
     <w:p>
       <w:pPr>
         <w:pStyle w:val="FootnoteText"/>
@@ -10737,45 +10789,11 @@
         <w:t xml:space="preserve"> </w:t>
       </w:r>
       <w:r>
-        <w:t xml:space="preserve">Question wording on preferred energy mix was intended to match previous research, including</w:t>
-      </w:r>
-      <w:r>
-        <w:t xml:space="preserve"> </w:t>
-      </w:r>
-      <w:r>
-        <w:t xml:space="preserve">Hawes and Nowlin (2022)</w:t>
-      </w:r>
-      <w:r>
-        <w:t xml:space="preserve">;</w:t>
-      </w:r>
-      <w:r>
-        <w:t xml:space="preserve"> </w:t>
-      </w:r>
-      <w:r>
-        <w:t xml:space="preserve">Ter-Mkrtchyan et al. (2022)</w:t>
+        <w:t xml:space="preserve">The supplemental materials contain more information on the weighting procedures as well as the results using unweighted data. Additionally, it includes a comparison of covariates across the three conditions to ensure balance. Finally, it includes the results controlling for demographics.</w:t>
       </w:r>
     </w:p>
   </w:footnote>
-  <w:footnote w:id="15">
-    <w:p>
-      <w:pPr>
-        <w:pStyle w:val="FootnoteText"/>
-      </w:pPr>
-      <w:r>
-        <w:rPr>
-          <w:rStyle w:val="FootnoteReference"/>
-        </w:rPr>
-        <w:footnoteRef/>
-      </w:r>
-      <w:r>
-        <w:t xml:space="preserve"> </w:t>
-      </w:r>
-      <w:r>
-        <w:t xml:space="preserve">For more information on the sample and the weighting procedures as well as a comparison of covariates across the three conditions see the supplemental materials.</w:t>
-      </w:r>
-    </w:p>
-  </w:footnote>
-  <w:footnote w:id="30">
+  <w:footnote w:id="29">
     <w:p>
       <w:pPr>
         <w:pStyle w:val="FootnoteText"/>
@@ -10946,12 +10964,14 @@
     <w:pPr>
       <w:spacing w:after="80" w:line="240" w:lineRule="auto"/>
       <w:contextualSpacing/>
-      <w:jc w:val="center"/>
+      <w:jc w:val="left"/>
     </w:pPr>
     <w:rPr>
+      <w:b/>
+      <w:bCs/>
       <w:rFonts w:asciiTheme="majorHAnsi" w:cstheme="majorBidi" w:eastAsiaTheme="majorEastAsia" w:hAnsiTheme="majorHAnsi"/>
-      <w:sz w:val="56"/>
-      <w:szCs w:val="56"/>
+      <w:sz w:val="36"/>
+      <w:szCs w:val="36"/>
     </w:rPr>
   </w:style>
   <w:style w:customStyle="1" w:styleId="TitleChar" w:type="character">
@@ -10961,9 +10981,11 @@
     <w:uiPriority w:val="10"/>
     <w:rsid w:val="00A10FD9"/>
     <w:rPr>
+      <w:b/>
+      <w:bCs/>
       <w:rFonts w:asciiTheme="majorHAnsi" w:cstheme="majorBidi" w:eastAsiaTheme="majorEastAsia" w:hAnsiTheme="majorHAnsi"/>
-      <w:sz w:val="56"/>
-      <w:szCs w:val="56"/>
+      <w:sz w:val="36"/>
+      <w:szCs w:val="36"/>
     </w:rPr>
   </w:style>
   <w:style w:styleId="Subtitle" w:type="paragraph">
@@ -10982,8 +11004,8 @@
     <w:rPr>
       <w:rFonts w:cstheme="majorBidi" w:eastAsiaTheme="majorEastAsia"/>
       <w:spacing w:val="15"/>
-      <w:sz w:val="28"/>
-      <w:szCs w:val="28"/>
+      <w:sz w:val="24"/>
+      <w:szCs w:val="24"/>
     </w:rPr>
   </w:style>
   <w:style w:customStyle="1" w:styleId="SubtitleChar" w:type="character">
@@ -10994,10 +11016,9 @@
     <w:rsid w:val="00A10FD9"/>
     <w:rPr>
       <w:rFonts w:cstheme="majorBidi" w:eastAsiaTheme="majorEastAsia"/>
-      <w:color w:themeColor="text1" w:themeTint="A6" w:val="595959"/>
       <w:spacing w:val="15"/>
-      <w:sz w:val="28"/>
-      <w:szCs w:val="28"/>
+      <w:sz w:val="24"/>
+      <w:szCs w:val="24"/>
     </w:rPr>
   </w:style>
   <w:style w:customStyle="1" w:styleId="Author" w:type="paragraph">
@@ -11041,8 +11062,8 @@
     </w:pPr>
     <w:rPr>
       <w:b/>
-      <w:sz w:val="20"/>
-      <w:szCs w:val="20"/>
+      <w:sz w:val="24"/>
+      <w:szCs w:val="24"/>
     </w:rPr>
   </w:style>
   <w:style w:customStyle="1" w:styleId="Abstract" w:type="paragraph">
@@ -11056,8 +11077,8 @@
       <w:spacing w:after="300" w:before="100"/>
     </w:pPr>
     <w:rPr>
-      <w:sz w:val="20"/>
-      <w:szCs w:val="20"/>
+      <w:sz w:val="24"/>
+      <w:szCs w:val="24"/>
     </w:rPr>
   </w:style>
   <w:style w:styleId="Bibliography" w:type="paragraph">
@@ -11083,10 +11104,11 @@
       <w:outlineLvl w:val="0"/>
     </w:pPr>
     <w:rPr>
+      <w:b/>
+      <w:bCs/>
       <w:rFonts w:asciiTheme="majorHAnsi" w:cstheme="majorBidi" w:eastAsiaTheme="majorEastAsia" w:hAnsiTheme="majorHAnsi"/>
-      <w:color w:themeColor="accent1" w:themeShade="BF" w:val="0F4761"/>
-      <w:sz w:val="40"/>
-      <w:szCs w:val="40"/>
+      <w:sz w:val="32"/>
+      <w:szCs w:val="32"/>
     </w:rPr>
   </w:style>
   <w:style w:styleId="Heading2" w:type="paragraph">
@@ -11106,10 +11128,11 @@
       <w:outlineLvl w:val="1"/>
     </w:pPr>
     <w:rPr>
+      <w:b/>
+      <w:bCs/>
       <w:rFonts w:asciiTheme="majorHAnsi" w:cstheme="majorBidi" w:eastAsiaTheme="majorEastAsia" w:hAnsiTheme="majorHAnsi"/>
-      <w:color w:themeColor="accent1" w:themeShade="BF" w:val="0F4761"/>
-      <w:sz w:val="32"/>
-      <w:szCs w:val="32"/>
+      <w:sz w:val="28"/>
+      <w:szCs w:val="28"/>
     </w:rPr>
   </w:style>
   <w:style w:styleId="Heading3" w:type="paragraph">
@@ -11129,10 +11152,11 @@
       <w:outlineLvl w:val="2"/>
     </w:pPr>
     <w:rPr>
+      <w:b/>
+      <w:bCs/>
       <w:rFonts w:cstheme="majorBidi" w:eastAsiaTheme="majorEastAsia"/>
-      <w:color w:themeColor="accent1" w:themeShade="BF" w:val="0F4761"/>
-      <w:sz w:val="28"/>
-      <w:szCs w:val="28"/>
+      <w:sz w:val="24"/>
+      <w:szCs w:val="24"/>
     </w:rPr>
   </w:style>
   <w:style w:styleId="Heading4" w:type="paragraph">
@@ -11152,10 +11176,13 @@
       <w:outlineLvl w:val="3"/>
     </w:pPr>
     <w:rPr>
+      <w:b/>
+      <w:bCs/>
+      <w:sz w:val="24"/>
+      <w:szCs w:val="24"/>
       <w:rFonts w:cstheme="majorBidi" w:eastAsiaTheme="majorEastAsia"/>
       <w:i/>
       <w:iCs/>
-      <w:color w:themeColor="accent1" w:themeShade="BF" w:val="0F4761"/>
     </w:rPr>
   </w:style>
   <w:style w:styleId="Heading5" w:type="paragraph">
@@ -11175,8 +11202,11 @@
       <w:outlineLvl w:val="4"/>
     </w:pPr>
     <w:rPr>
+      <w:b/>
+      <w:bCs/>
+      <w:sz w:val="24"/>
+      <w:szCs w:val="24"/>
       <w:rFonts w:cstheme="majorBidi" w:eastAsiaTheme="majorEastAsia"/>
-      <w:color w:themeColor="accent1" w:themeShade="BF" w:val="0F4761"/>
     </w:rPr>
   </w:style>
   <w:style w:styleId="Heading6" w:type="paragraph">
@@ -11196,10 +11226,13 @@
       <w:outlineLvl w:val="5"/>
     </w:pPr>
     <w:rPr>
+      <w:b/>
+      <w:bCs/>
+      <w:sz w:val="24"/>
+      <w:szCs w:val="24"/>
       <w:rFonts w:cstheme="majorBidi" w:eastAsiaTheme="majorEastAsia"/>
       <w:i/>
       <w:iCs/>
-      <w:color w:themeColor="text1" w:themeTint="A6" w:val="595959"/>
     </w:rPr>
   </w:style>
   <w:style w:styleId="Heading7" w:type="paragraph">
@@ -11219,8 +11252,11 @@
       <w:outlineLvl w:val="6"/>
     </w:pPr>
     <w:rPr>
+      <w:b/>
+      <w:bCs/>
+      <w:sz w:val="24"/>
+      <w:szCs w:val="24"/>
       <w:rFonts w:cstheme="majorBidi" w:eastAsiaTheme="majorEastAsia"/>
-      <w:color w:themeColor="text1" w:themeTint="A6" w:val="595959"/>
     </w:rPr>
   </w:style>
   <w:style w:styleId="Heading8" w:type="paragraph">
@@ -11240,10 +11276,13 @@
       <w:outlineLvl w:val="7"/>
     </w:pPr>
     <w:rPr>
+      <w:b/>
+      <w:bCs/>
+      <w:sz w:val="24"/>
+      <w:szCs w:val="24"/>
       <w:rFonts w:cstheme="majorBidi" w:eastAsiaTheme="majorEastAsia"/>
       <w:i/>
       <w:iCs/>
-      <w:color w:themeColor="text1" w:themeTint="D8" w:val="272727"/>
     </w:rPr>
   </w:style>
   <w:style w:styleId="Heading9" w:type="paragraph">
@@ -11263,8 +11302,11 @@
       <w:outlineLvl w:val="8"/>
     </w:pPr>
     <w:rPr>
+      <w:b/>
+      <w:bCs/>
+      <w:sz w:val="24"/>
+      <w:szCs w:val="24"/>
       <w:rFonts w:cstheme="majorBidi" w:eastAsiaTheme="majorEastAsia"/>
-      <w:color w:themeColor="text1" w:themeTint="D8" w:val="272727"/>
     </w:rPr>
   </w:style>
   <w:style w:customStyle="1" w:styleId="Heading1Char" w:type="character">
@@ -11274,10 +11316,11 @@
     <w:uiPriority w:val="9"/>
     <w:rsid w:val="00A10FD9"/>
     <w:rPr>
+      <w:b/>
+      <w:bCs/>
       <w:rFonts w:asciiTheme="majorHAnsi" w:cstheme="majorBidi" w:eastAsiaTheme="majorEastAsia" w:hAnsiTheme="majorHAnsi"/>
-      <w:color w:themeColor="accent1" w:themeShade="BF" w:val="0F4761"/>
-      <w:sz w:val="40"/>
-      <w:szCs w:val="40"/>
+      <w:sz w:val="32"/>
+      <w:szCs w:val="32"/>
     </w:rPr>
   </w:style>
   <w:style w:customStyle="1" w:styleId="Heading2Char" w:type="character">
@@ -11288,10 +11331,11 @@
     <w:semiHidden/>
     <w:rsid w:val="00A10FD9"/>
     <w:rPr>
+      <w:b/>
+      <w:bCs/>
       <w:rFonts w:asciiTheme="majorHAnsi" w:cstheme="majorBidi" w:eastAsiaTheme="majorEastAsia" w:hAnsiTheme="majorHAnsi"/>
-      <w:color w:themeColor="accent1" w:themeShade="BF" w:val="0F4761"/>
-      <w:sz w:val="32"/>
-      <w:szCs w:val="32"/>
+      <w:sz w:val="28"/>
+      <w:szCs w:val="28"/>
     </w:rPr>
   </w:style>
   <w:style w:customStyle="1" w:styleId="Heading3Char" w:type="character">
@@ -11302,10 +11346,11 @@
     <w:semiHidden/>
     <w:rsid w:val="00A10FD9"/>
     <w:rPr>
+      <w:b/>
+      <w:bCs/>
       <w:rFonts w:cstheme="majorBidi" w:eastAsiaTheme="majorEastAsia"/>
-      <w:color w:themeColor="accent1" w:themeShade="BF" w:val="0F4761"/>
-      <w:sz w:val="28"/>
-      <w:szCs w:val="28"/>
+      <w:sz w:val="24"/>
+      <w:szCs w:val="24"/>
     </w:rPr>
   </w:style>
   <w:style w:customStyle="1" w:styleId="Heading4Char" w:type="character">
@@ -11316,10 +11361,11 @@
     <w:semiHidden/>
     <w:rsid w:val="00A10FD9"/>
     <w:rPr>
+      <w:b/>
+      <w:bCs/>
       <w:rFonts w:cstheme="majorBidi" w:eastAsiaTheme="majorEastAsia"/>
       <w:i/>
       <w:iCs/>
-      <w:color w:themeColor="accent1" w:themeShade="BF" w:val="0F4761"/>
     </w:rPr>
   </w:style>
   <w:style w:customStyle="1" w:styleId="Heading5Char" w:type="character">
@@ -11330,8 +11376,9 @@
     <w:semiHidden/>
     <w:rsid w:val="00A10FD9"/>
     <w:rPr>
+      <w:b/>
+      <w:bCs/>
       <w:rFonts w:cstheme="majorBidi" w:eastAsiaTheme="majorEastAsia"/>
-      <w:color w:themeColor="accent1" w:themeShade="BF" w:val="0F4761"/>
     </w:rPr>
   </w:style>
   <w:style w:customStyle="1" w:styleId="Heading6Char" w:type="character">
@@ -11342,10 +11389,11 @@
     <w:semiHidden/>
     <w:rsid w:val="00A10FD9"/>
     <w:rPr>
+      <w:b/>
+      <w:bCs/>
       <w:rFonts w:cstheme="majorBidi" w:eastAsiaTheme="majorEastAsia"/>
       <w:i/>
       <w:iCs/>
-      <w:color w:themeColor="text1" w:themeTint="A6" w:val="595959"/>
     </w:rPr>
   </w:style>
   <w:style w:customStyle="1" w:styleId="Heading7Char" w:type="character">
@@ -11356,8 +11404,9 @@
     <w:semiHidden/>
     <w:rsid w:val="00A10FD9"/>
     <w:rPr>
+      <w:b/>
+      <w:bCs/>
       <w:rFonts w:cstheme="majorBidi" w:eastAsiaTheme="majorEastAsia"/>
-      <w:color w:themeColor="text1" w:themeTint="A6" w:val="595959"/>
     </w:rPr>
   </w:style>
   <w:style w:customStyle="1" w:styleId="Heading8Char" w:type="character">
@@ -11368,10 +11417,11 @@
     <w:semiHidden/>
     <w:rsid w:val="00A10FD9"/>
     <w:rPr>
+      <w:b/>
+      <w:bCs/>
       <w:rFonts w:cstheme="majorBidi" w:eastAsiaTheme="majorEastAsia"/>
       <w:i/>
       <w:iCs/>
-      <w:color w:themeColor="text1" w:themeTint="D8" w:val="272727"/>
     </w:rPr>
   </w:style>
   <w:style w:customStyle="1" w:styleId="Heading9Char" w:type="character">
@@ -11382,8 +11432,9 @@
     <w:semiHidden/>
     <w:rsid w:val="00A10FD9"/>
     <w:rPr>
+      <w:b/>
+      <w:bCs/>
       <w:rFonts w:cstheme="majorBidi" w:eastAsiaTheme="majorEastAsia"/>
-      <w:color w:themeColor="text1" w:themeTint="D8" w:val="272727"/>
     </w:rPr>
   </w:style>
   <w:style w:styleId="BlockText" w:type="paragraph">
@@ -11405,6 +11456,10 @@
     <w:uiPriority w:val="9"/>
     <w:unhideWhenUsed/>
     <w:qFormat/>
+    <w:rPr>
+      <w:sz w:val="20"/>
+      <w:szCs w:val="20"/>
+    </w:rPr>
   </w:style>
   <w:style w:styleId="FootnoteBlockText" w:type="paragraph">
     <w:name w:val="Footnote Block Text"/>
@@ -11854,7 +11909,7 @@
     </a:clrScheme>
     <a:fontScheme name="Office">
       <a:majorFont>
-        <a:latin typeface="Aptos Display" panose="02110004020202020204"/>
+        <a:latin typeface="Times New Roman" panose="02020603050405020304"/>
         <a:ea typeface=""/>
         <a:cs typeface=""/>
         <a:font script="Jpan" typeface="游ゴシック Light"/>
@@ -11906,7 +11961,7 @@
         <a:font script="Tfng" typeface="Ebrima"/>
       </a:majorFont>
       <a:minorFont>
-        <a:latin typeface="Aptos" panose="02110004020202020204"/>
+        <a:latin typeface="Times New Roman" panose="02020603050405020304"/>
         <a:ea typeface=""/>
         <a:cs typeface=""/>
         <a:font script="Jpan" typeface="游明朝"/>

</xml_diff>